<commit_message>
Add figure placeholders and a cover letter for submission
</commit_message>
<xml_diff>
--- a/submission/Ethambutol_TADS_manuscript.docx
+++ b/submission/Ethambutol_TADS_manuscript.docx
@@ -355,6 +355,14 @@
       </w:r>
     </w:p>
     <w:p>
+      <w:r>
+        <w:rPr>
+          <w:i/>
+        </w:rPr>
+        <w:t>[Figure 1 near here]</w:t>
+      </w:r>
+    </w:p>
+    <w:p>
       <w:pPr>
         <w:jc w:val="both"/>
       </w:pPr>
@@ -563,6 +571,14 @@
       </w:r>
     </w:p>
     <w:p>
+      <w:r>
+        <w:rPr>
+          <w:i/>
+        </w:rPr>
+        <w:t>[Figure 2 near here]</w:t>
+      </w:r>
+    </w:p>
+    <w:p>
       <w:pPr>
         <w:jc w:val="both"/>
       </w:pPr>
@@ -587,6 +603,14 @@
       </w:r>
     </w:p>
     <w:p>
+      <w:r>
+        <w:rPr>
+          <w:i/>
+        </w:rPr>
+        <w:t>[Figure 3 near here]</w:t>
+      </w:r>
+    </w:p>
+    <w:p>
       <w:pPr>
         <w:jc w:val="both"/>
       </w:pPr>
@@ -608,6 +632,14 @@
       </w:pPr>
       <w:r>
         <w:t>Restricting exposure to reports naming ethambutol as the primary or secondary suspect drug increased both estimates, because the cohort is smaller and more specifically exposed: the query rose from 23.51 to 35.01 (370 cases exposed) and optic neuropathy from 116.58 to 191.22 (157 cases) (Figure 4).</w:t>
+      </w:r>
+    </w:p>
+    <w:p>
+      <w:r>
+        <w:rPr>
+          <w:i/>
+        </w:rPr>
+        <w:t>[Figure 4 near here]</w:t>
       </w:r>
     </w:p>
     <w:p>

</xml_diff>

<commit_message>
Fix Word reference paragraphs and code spans, add figure captions, correct PDF caption escaping and placement
</commit_message>
<xml_diff>
--- a/submission/Ethambutol_TADS_manuscript.docx
+++ b/submission/Ethambutol_TADS_manuscript.docx
@@ -335,7 +335,27 @@
         <w:jc w:val="both"/>
       </w:pPr>
       <w:r>
-        <w:t>FAERS reports were obtained from the FDA quarterly ASCII releases from 2004Q1 to 2026Q2, ninety quarters in all, retrieved from the official distribution endpoint. These are the unaggregated files; the harmonised openFDA view was not used as the primary source because it omits the raw `CASEID` and `FDA_DT` fields required for case-version de-duplication. JADER, the Japanese system maintained by the Pharmaceuticals and Medical Devices Agency, was analysed from its September 2026 release (1,054,239 cases, 5,038,223 drug records and 1,751,879 reaction records). Canada Vigilance was analysed from Health Canada's case-level extract (cvponline, 31 May 2026), which holds 1,266,430 reports coded to MedDRA 29.0.</w:t>
+        <w:t xml:space="preserve">FAERS reports were obtained from the FDA quarterly ASCII releases from 2004Q1 to 2026Q2, ninety quarters in all, retrieved from the official distribution endpoint. These are the unaggregated files; the harmonised openFDA view was not used as the primary source because it omits the raw </w:t>
+      </w:r>
+      <w:r>
+        <w:rPr>
+          <w:rFonts w:ascii="Consolas" w:hAnsi="Consolas"/>
+          <w:sz w:val="19"/>
+        </w:rPr>
+        <w:t>CASEID</w:t>
+      </w:r>
+      <w:r>
+        <w:t xml:space="preserve"> and </w:t>
+      </w:r>
+      <w:r>
+        <w:rPr>
+          <w:rFonts w:ascii="Consolas" w:hAnsi="Consolas"/>
+          <w:sz w:val="19"/>
+        </w:rPr>
+        <w:t>FDA_DT</w:t>
+      </w:r>
+      <w:r>
+        <w:t xml:space="preserve"> fields required for case-version de-duplication. JADER, the Japanese system maintained by the Pharmaceuticals and Medical Devices Agency, was analysed from its September 2026 release (1,054,239 cases, 5,038,223 drug records and 1,751,879 reaction records). Canada Vigilance was analysed from Health Canada's case-level extract (cvponline, 31 May 2026), which holds 1,266,430 reports coded to MedDRA 29.0.</w:t>
       </w:r>
     </w:p>
     <w:p>
@@ -351,7 +371,37 @@
         <w:jc w:val="both"/>
       </w:pPr>
       <w:r>
-        <w:t>A case may be re-submitted in a later quarter when new information arrives, so several versions of one `CASEID` can coexist. Following the FDA's own convention, only the most recent version was retained, defined as the record with the highest `FDA_DT`, with ties broken by the highest `PRIMARYID`. All FAERS analyses are on this de-duplicated case set. The submission count, the de-duplicated count and the number removed are reported in the case flow (Figure 1).</w:t>
+        <w:t xml:space="preserve">A case may be re-submitted in a later quarter when new information arrives, so several versions of one </w:t>
+      </w:r>
+      <w:r>
+        <w:rPr>
+          <w:rFonts w:ascii="Consolas" w:hAnsi="Consolas"/>
+          <w:sz w:val="19"/>
+        </w:rPr>
+        <w:t>CASEID</w:t>
+      </w:r>
+      <w:r>
+        <w:t xml:space="preserve"> can coexist. Following the FDA's own convention, only the most recent version was retained, defined as the record with the highest </w:t>
+      </w:r>
+      <w:r>
+        <w:rPr>
+          <w:rFonts w:ascii="Consolas" w:hAnsi="Consolas"/>
+          <w:sz w:val="19"/>
+        </w:rPr>
+        <w:t>FDA_DT</w:t>
+      </w:r>
+      <w:r>
+        <w:t xml:space="preserve">, with ties broken by the highest </w:t>
+      </w:r>
+      <w:r>
+        <w:rPr>
+          <w:rFonts w:ascii="Consolas" w:hAnsi="Consolas"/>
+          <w:sz w:val="19"/>
+        </w:rPr>
+        <w:t>PRIMARYID</w:t>
+      </w:r>
+      <w:r>
+        <w:t>. All FAERS analyses are on this de-duplicated case set. The submission count, the de-duplicated count and the number removed are reported in the case flow (Figure 1).</w:t>
       </w:r>
     </w:p>
     <w:p>
@@ -375,7 +425,27 @@
         <w:jc w:val="both"/>
       </w:pPr>
       <w:r>
-        <w:t>Exposure was defined as the appearance of ethambutol in the report's drug-name fields (`drugname` and `prod_ai`), identified with a case-insensitive substring match on the single name token ETHAMBUTOL. Brand and salt variants were not added to that token in FAERS, so a report naming only a brand product would not be captured; Canada Vigilance was read from the ingredient table for this reason (Section 2.8). No restriction on drug role was applied in the main analysis; restriction to reports naming ethambutol as the primary or secondary suspect drug is a sensitivity analysis. Three comparator drugs were defined in the same way for the within-class analysis: isoniazid, rifampicin and pyrazinamide.</w:t>
+        <w:t>Exposure was defined as the appearance of ethambutol in the report's drug-name fields (</w:t>
+      </w:r>
+      <w:r>
+        <w:rPr>
+          <w:rFonts w:ascii="Consolas" w:hAnsi="Consolas"/>
+          <w:sz w:val="19"/>
+        </w:rPr>
+        <w:t>drugname</w:t>
+      </w:r>
+      <w:r>
+        <w:t xml:space="preserve"> and </w:t>
+      </w:r>
+      <w:r>
+        <w:rPr>
+          <w:rFonts w:ascii="Consolas" w:hAnsi="Consolas"/>
+          <w:sz w:val="19"/>
+        </w:rPr>
+        <w:t>prod_ai</w:t>
+      </w:r>
+      <w:r>
+        <w:t>), identified with a case-insensitive substring match on the single name token ETHAMBUTOL. Brand and salt variants were not added to that token in FAERS, so a report naming only a brand product would not be captured; Canada Vigilance was read from the ingredient table for this reason (Section 2.8). No restriction on drug role was applied in the main analysis; restriction to reports naming ethambutol as the primary or secondary suspect drug is a sensitivity analysis. Three comparator drugs were defined in the same way for the within-class analysis: isoniazid, rifampicin and pyrazinamide.</w:t>
       </w:r>
     </w:p>
     <w:p>
@@ -391,7 +461,17 @@
         <w:jc w:val="both"/>
       </w:pPr>
       <w:r>
-        <w:t>The primary outcome was the Optic nerve disorders narrow Standardised MedDRA Query. Outcomes were defined with MedDRA's own queries rather than with a list assembled for this study: the narrow term lists were read from the MedDRA 29.0 distribution file (`smq_content.asc`), and all eleven ocular queries were evaluated at preferred-term level with the same rules, so that the site of interest could not be selected after the results were seen. The eleven queries are Optic nerve disorders, Retinal disorders, Glaucoma, Lens disorders, Lacrimal disorders, Corneal disorders, Conjunctival disorders, Scleral disorders, Periorbital and eyelid disorders, Ocular infections and Ocular motility disorders. The query set and the control terms were fixed before the disproportionality analyses were run, but the analysis was not prospectively registered and those selections were made after the database data were available. Terms may belong to more than one query, and the set is not claimed to be exhaustive of all ocular terminology.</w:t>
+        <w:t>The primary outcome was the Optic nerve disorders narrow Standardised MedDRA Query. Outcomes were defined with MedDRA's own queries rather than with a list assembled for this study: the narrow term lists were read from the MedDRA 29.0 distribution file (</w:t>
+      </w:r>
+      <w:r>
+        <w:rPr>
+          <w:rFonts w:ascii="Consolas" w:hAnsi="Consolas"/>
+          <w:sz w:val="19"/>
+        </w:rPr>
+        <w:t>smq_content.asc</w:t>
+      </w:r>
+      <w:r>
+        <w:t>), and all eleven ocular queries were evaluated at preferred-term level with the same rules, so that the site of interest could not be selected after the results were seen. The eleven queries are Optic nerve disorders, Retinal disorders, Glaucoma, Lens disorders, Lacrimal disorders, Corneal disorders, Conjunctival disorders, Scleral disorders, Periorbital and eyelid disorders, Ocular infections and Ocular motility disorders. The query set and the control terms were fixed before the disproportionality analyses were run, but the analysis was not prospectively registered and those selections were made after the database data were available. Terms may belong to more than one query, and the set is not claimed to be exhaustive of all ocular terminology.</w:t>
       </w:r>
     </w:p>
     <w:p>
@@ -527,7 +607,27 @@
         <w:jc w:val="both"/>
       </w:pPr>
       <w:r>
-        <w:t>All analyses were run as standalone, re-runnable Python scripts with recorded software versions and random seeds. The de-duplication map, the 2×2 tables, the query-level results, the preferred-term results, the period split and the fixed-regimen contrast are all exported to a single results file (`results/main_results.json`), from which the tables in this paper are generated, so that no number is transcribed by hand. The code, the derived tables and a data dictionary are available at the repository given in the Statements, under the release tag `v2.0-tads-2026-10-21`, which identifies the commit from which the numbers, tables and figures in this manuscript were generated.</w:t>
+        <w:t>All analyses were run as standalone, re-runnable Python scripts with recorded software versions and random seeds. The de-duplication map, the 2×2 tables, the query-level results, the preferred-term results, the period split and the fixed-regimen contrast are all exported to a single results file (</w:t>
+      </w:r>
+      <w:r>
+        <w:rPr>
+          <w:rFonts w:ascii="Consolas" w:hAnsi="Consolas"/>
+          <w:sz w:val="19"/>
+        </w:rPr>
+        <w:t>results/main_results.json</w:t>
+      </w:r>
+      <w:r>
+        <w:t xml:space="preserve">), from which the tables in this paper are generated, so that no number is transcribed by hand. The code, the derived tables and a data dictionary are available at the repository given in the Statements, under the release tag </w:t>
+      </w:r>
+      <w:r>
+        <w:rPr>
+          <w:rFonts w:ascii="Consolas" w:hAnsi="Consolas"/>
+          <w:sz w:val="19"/>
+        </w:rPr>
+        <w:t>v2.0-tads-2026-10-21</w:t>
+      </w:r>
+      <w:r>
+        <w:t>, which identifies the commit from which the numbers, tables and figures in this manuscript were generated.</w:t>
       </w:r>
     </w:p>
     <w:p>
@@ -929,7 +1029,27 @@
         <w:t>Availability of data and materials.</w:t>
       </w:r>
       <w:r>
-        <w:t xml:space="preserve"> FAERS quarterly ASCII releases are available from the U.S. Food and Drug Administration (https://fis.fda.gov/extensions/FPD-QDE-FAERS/FPD-QDE-FAERS.html); JADER from the Pharmaceuticals and Medical Devices Agency of Japan; Canada Vigilance from Health Canada (cvponline); GSE294687 and GSE318912 from NCBI GEO. The derived tables that support the findings — the de-duplication map, the 2×2 tables, `results/main_results.json` and the code that generates every table and figure — are available at https://github.com/Bowen2485/ethambutol-ocular-toxicity/tree/v2.0-tads-2026-10-21 (release tag `v2.0-tads-2026-10-21`) under an MIT licence.</w:t>
+        <w:t xml:space="preserve"> FAERS quarterly ASCII releases are available from the U.S. Food and Drug Administration (https://fis.fda.gov/extensions/FPD-QDE-FAERS/FPD-QDE-FAERS.html); JADER from the Pharmaceuticals and Medical Devices Agency of Japan; Canada Vigilance from Health Canada (cvponline); GSE294687 and GSE318912 from NCBI GEO. The derived tables that support the findings — the de-duplication map, the 2×2 tables, </w:t>
+      </w:r>
+      <w:r>
+        <w:rPr>
+          <w:rFonts w:ascii="Consolas" w:hAnsi="Consolas"/>
+          <w:sz w:val="19"/>
+        </w:rPr>
+        <w:t>results/main_results.json</w:t>
+      </w:r>
+      <w:r>
+        <w:t xml:space="preserve"> and the code that generates every table and figure — are available at https://github.com/Bowen2485/ethambutol-ocular-toxicity/tree/v2.0-tads-2026-10-21 (release tag </w:t>
+      </w:r>
+      <w:r>
+        <w:rPr>
+          <w:rFonts w:ascii="Consolas" w:hAnsi="Consolas"/>
+          <w:sz w:val="19"/>
+        </w:rPr>
+        <w:t>v2.0-tads-2026-10-21</w:t>
+      </w:r>
+      <w:r>
+        <w:t>) under an MIT licence.</w:t>
       </w:r>
     </w:p>
     <w:p>
@@ -5548,23 +5668,178 @@
     </w:p>
     <w:p>
       <w:pPr>
-        <w:jc w:val="both"/>
+        <w:spacing w:after="80"/>
+        <w:ind w:left="397" w:hanging="397"/>
       </w:pPr>
       <w:r>
-        <w:t>1. Chamberlain PD, Sadaka A, Berry S, Lee AG. Ethambutol optic neuropathy. Curr Opin Ophthalmol. 2017;28(6):545-551. doi:10.1097/icu.0000000000000416. 2. Ambika S, Lakshmi KP, Gopal M, Noronha OV. Visual outcomes of toxic optic neuropathy secondary to Ethambutol: A retrospective observational study from India, an endemic country. Indian J Ophthalmol. 2022;70(9):3388-3392. doi:10.4103/ijo.ijo_2996_21. 3. An HR, Lee BJ, Moon Y. Visual Recovery Time in Patients with Ethambutol-induced Toxic Optic Neuropathy. Korean J Ophthalmol. 2024;38(2):91-97. doi:10.3341/kjo.2023.0095. 4. Singh P, Karkhur S, Verma V. Ethambutol-Induced Optic Neuropathy: A Retrospective Study of Incidences and Risk Factors. Cureus. 2025;17(2):e79160. doi:10.7759/cureus.79160. 5. Chaitanuwong P, Srithawatpong S, Ruamviboonsuk P, Apinyawasisuk S, Watcharapanjamart A, Moss HE. Incidence, risk factors and ophthalmic clinical characteristic of ethambutol-induced optic neuropathy: 7-year experience. Front Ophthalmol (Lausanne). 2023;3:1152215. doi:10.3389/fopht.2023.1152215. 6. Lee S, Ryu WY, Kang D, Lee JK. Prevalence and Incidence of Ethambutol-Induced Optic Neuropathy and Its Risk Factors in Korea: A Nationwide Population-Based Study. J Korean Med Sci. 2025;40(20):e65. doi:10.3346/jkms.2025.40.e65. 7. Liu SS, Feng SC, Wu MF, Chin CS, Chen HC, Huang WC. Programmatic Assessment of Ethambutol-Related Optic Neuropathy in Patients with Mycobacterial Infections: A Prospective Observational Cohort Study. Infect Dis Ther. 2025;14(10):2391-2404. doi:10.1007/s40121-025-01219-x. 8. Mandal S, Saxena R, Dhiman R, Mohan A, Padhy SK, Phuljhele S, et al. Prospective study to evaluate incidence and indicators for early detection of ethambutol toxicity. Br J Ophthalmol. 2021;105(7):1024-1028. doi:10.1136/bjophthalmol-2020-316897. 9. Sachdeva G, Dhiman R, Raj D, Lavanya G, Mohan A, Pujari A, et al. Evaluation of visual function and OCT parameters in ethambutol-induced optic neuropathy: a longitudinal study. Br J Ophthalmol. 2026;110(2):185-190. doi:10.1136/bjo-2025-327475. 10. Lee JY, Choi JH, Park KA, Oh SY. Ganglion Cell Layer and Inner Plexiform Layer as Predictors of Vision Recovery in Ethambutol-Induced Optic Neuropathy: A Longitudinal OCT Analysis. Invest Ophthalmol Vis Sci. 2018;59(5):2104-2109. doi:10.1167/iovs.17-22988. 11. Kang MC, Eun HW, Park KA, Oh SY. Optical Coherence Tomography Parameters and Optimal Cut-off Values for Predicting Visual Prognosis in Ethambutol-Induced Optic Neuropathy. J Neuroophthalmol. 2024;44(4):559-564. doi:10.1097/wno.0000000000002092. 12. Han KE, Yoon H, Choi H, Lee JE, Kim SJ. Factors affecting visual outcome in patients with toxic optic neuropathy caused by ethambutol. Sci Rep. 2025;15(1):6257. doi:10.1038/s41598-025-90663-3. 13. Sheth J, Sachdeva V, Goyal A, Parikh A, Nalawade R, Nanavati H, et al. Clinical profile and visual outcomes in ethambutol-induced toxic optic neuropathy. Indian J Ophthalmol. 2025;73(Suppl 3):S484-S491. doi:10.4103/ijo.ijo_1807_24. 14. Mao Q, Ou ZM. Mining of adverse reaction signals and medication insights of anti-tuberculosis drugs based on the FAERS database. Asia-Pacific Medical Frontiers. 2026;1(3):1-18. 15. Suresh J, Kumar R, Hissar S, Shukla S, Vivekanandan K. Ocular toxicity associated with Ethambutol in the South-East Asia Region. Int Ophthalmol. 2026;46(1):251. doi:10.1007/s10792-026-04131-6. 16. Fusaroli M, Salvo F, Begaud B, AlShammari TM, Bate A, Battini V, et al. The Reporting of a Disproportionality Analysis for Drug Safety Signal Detection Using Individual Case Safety Reports in PharmacoVigilance (READUS-PV): Development and Statement. Drug Saf. 2024;47(6):575-584. doi:10.1007/s40264-024-01421-9. 17. Langan SM, Schmidt SA, Wing K, Ehrenstein V, Nicholls SG, Filion KB, et al. The reporting of studies conducted using observational routinely collected health data statement for pharmacoepidemiology (RECORD-PE). BMJ. 2018;363:k3532. doi:10.1136/bmj.k3532. 18. Cheng HC, Wong YH, Wang AG, Chen SW, Yang YL, Juan HC, et al. Müller glia-mediated protection of retinal ganglion cells from ethambutol-induced neurotoxicity through brain-derived neurotrophic factor. Cell Commun Signal. 2025;23(1):474. doi:10.1186/s12964-025-02478-4. 19. Li Q, Ge W, Zhang Y, Xu Q, Xu J, Zhang Y, et al. Ethambutol induces optic neuropathy through SDHB-mediated ferroptosis in retinal ganglion cells via Smad4 pathway. Hum Cell. 2026;39(2):37. doi:10.1007/s13577-025-01342-4.</w:t>
+        <w:t>1. Chamberlain PD, Sadaka A, Berry S, Lee AG. Ethambutol optic neuropathy. Curr Opin Ophthalmol. 2017;28(6):545-551. doi:10.1097/icu.0000000000000416.</w:t>
+      </w:r>
+    </w:p>
+    <w:p>
+      <w:pPr>
+        <w:spacing w:after="80"/>
+        <w:ind w:left="397" w:hanging="397"/>
+      </w:pPr>
+      <w:r>
+        <w:t>2. Ambika S, Lakshmi KP, Gopal M, Noronha OV. Visual outcomes of toxic optic neuropathy secondary to Ethambutol: A retrospective observational study from India, an endemic country. Indian J Ophthalmol. 2022;70(9):3388-3392. doi:10.4103/ijo.ijo_2996_21.</w:t>
+      </w:r>
+    </w:p>
+    <w:p>
+      <w:pPr>
+        <w:spacing w:after="80"/>
+        <w:ind w:left="397" w:hanging="397"/>
+      </w:pPr>
+      <w:r>
+        <w:t>3. An HR, Lee BJ, Moon Y. Visual Recovery Time in Patients with Ethambutol-induced Toxic Optic Neuropathy. Korean J Ophthalmol. 2024;38(2):91-97. doi:10.3341/kjo.2023.0095.</w:t>
+      </w:r>
+    </w:p>
+    <w:p>
+      <w:pPr>
+        <w:spacing w:after="80"/>
+        <w:ind w:left="397" w:hanging="397"/>
+      </w:pPr>
+      <w:r>
+        <w:t>4. Singh P, Karkhur S, Verma V. Ethambutol-Induced Optic Neuropathy: A Retrospective Study of Incidences and Risk Factors. Cureus. 2025;17(2):e79160. doi:10.7759/cureus.79160.</w:t>
+      </w:r>
+    </w:p>
+    <w:p>
+      <w:pPr>
+        <w:spacing w:after="80"/>
+        <w:ind w:left="397" w:hanging="397"/>
+      </w:pPr>
+      <w:r>
+        <w:t>5. Chaitanuwong P, Srithawatpong S, Ruamviboonsuk P, Apinyawasisuk S, Watcharapanjamart A, Moss HE. Incidence, risk factors and ophthalmic clinical characteristic of ethambutol-induced optic neuropathy: 7-year experience. Front Ophthalmol (Lausanne). 2023;3:1152215. doi:10.3389/fopht.2023.1152215.</w:t>
+      </w:r>
+    </w:p>
+    <w:p>
+      <w:pPr>
+        <w:spacing w:after="80"/>
+        <w:ind w:left="397" w:hanging="397"/>
+      </w:pPr>
+      <w:r>
+        <w:t>6. Lee S, Ryu WY, Kang D, Lee JK. Prevalence and Incidence of Ethambutol-Induced Optic Neuropathy and Its Risk Factors in Korea: A Nationwide Population-Based Study. J Korean Med Sci. 2025;40(20):e65. doi:10.3346/jkms.2025.40.e65.</w:t>
+      </w:r>
+    </w:p>
+    <w:p>
+      <w:pPr>
+        <w:spacing w:after="80"/>
+        <w:ind w:left="397" w:hanging="397"/>
+      </w:pPr>
+      <w:r>
+        <w:t>7. Liu SS, Feng SC, Wu MF, Chin CS, Chen HC, Huang WC. Programmatic Assessment of Ethambutol-Related Optic Neuropathy in Patients with Mycobacterial Infections: A Prospective Observational Cohort Study. Infect Dis Ther. 2025;14(10):2391-2404. doi:10.1007/s40121-025-01219-x.</w:t>
+      </w:r>
+    </w:p>
+    <w:p>
+      <w:pPr>
+        <w:spacing w:after="80"/>
+        <w:ind w:left="397" w:hanging="397"/>
+      </w:pPr>
+      <w:r>
+        <w:t>8. Mandal S, Saxena R, Dhiman R, Mohan A, Padhy SK, Phuljhele S, et al. Prospective study to evaluate incidence and indicators for early detection of ethambutol toxicity. Br J Ophthalmol. 2021;105(7):1024-1028. doi:10.1136/bjophthalmol-2020-316897.</w:t>
+      </w:r>
+    </w:p>
+    <w:p>
+      <w:pPr>
+        <w:spacing w:after="80"/>
+        <w:ind w:left="397" w:hanging="397"/>
+      </w:pPr>
+      <w:r>
+        <w:t>9. Sachdeva G, Dhiman R, Raj D, Lavanya G, Mohan A, Pujari A, et al. Evaluation of visual function and OCT parameters in ethambutol-induced optic neuropathy: a longitudinal study. Br J Ophthalmol. 2026;110(2):185-190. doi:10.1136/bjo-2025-327475.</w:t>
+      </w:r>
+    </w:p>
+    <w:p>
+      <w:pPr>
+        <w:spacing w:after="80"/>
+        <w:ind w:left="397" w:hanging="397"/>
+      </w:pPr>
+      <w:r>
+        <w:t>10. Lee JY, Choi JH, Park KA, Oh SY. Ganglion Cell Layer and Inner Plexiform Layer as Predictors of Vision Recovery in Ethambutol-Induced Optic Neuropathy: A Longitudinal OCT Analysis. Invest Ophthalmol Vis Sci. 2018;59(5):2104-2109. doi:10.1167/iovs.17-22988.</w:t>
+      </w:r>
+    </w:p>
+    <w:p>
+      <w:pPr>
+        <w:spacing w:after="80"/>
+        <w:ind w:left="397" w:hanging="397"/>
+      </w:pPr>
+      <w:r>
+        <w:t>11. Kang MC, Eun HW, Park KA, Oh SY. Optical Coherence Tomography Parameters and Optimal Cut-off Values for Predicting Visual Prognosis in Ethambutol-Induced Optic Neuropathy. J Neuroophthalmol. 2024;44(4):559-564. doi:10.1097/wno.0000000000002092.</w:t>
+      </w:r>
+    </w:p>
+    <w:p>
+      <w:pPr>
+        <w:spacing w:after="80"/>
+        <w:ind w:left="397" w:hanging="397"/>
+      </w:pPr>
+      <w:r>
+        <w:t>12. Han KE, Yoon H, Choi H, Lee JE, Kim SJ. Factors affecting visual outcome in patients with toxic optic neuropathy caused by ethambutol. Sci Rep. 2025;15(1):6257. doi:10.1038/s41598-025-90663-3.</w:t>
+      </w:r>
+    </w:p>
+    <w:p>
+      <w:pPr>
+        <w:spacing w:after="80"/>
+        <w:ind w:left="397" w:hanging="397"/>
+      </w:pPr>
+      <w:r>
+        <w:t>13. Sheth J, Sachdeva V, Goyal A, Parikh A, Nalawade R, Nanavati H, et al. Clinical profile and visual outcomes in ethambutol-induced toxic optic neuropathy. Indian J Ophthalmol. 2025;73(Suppl 3):S484-S491. doi:10.4103/ijo.ijo_1807_24.</w:t>
+      </w:r>
+    </w:p>
+    <w:p>
+      <w:pPr>
+        <w:spacing w:after="80"/>
+        <w:ind w:left="397" w:hanging="397"/>
+      </w:pPr>
+      <w:r>
+        <w:t>14. Mao Q, Ou ZM. Mining of adverse reaction signals and medication insights of anti-tuberculosis drugs based on the FAERS database. Asia-Pacific Medical Frontiers. 2026;1(3):1-18.</w:t>
+      </w:r>
+    </w:p>
+    <w:p>
+      <w:pPr>
+        <w:spacing w:after="80"/>
+        <w:ind w:left="397" w:hanging="397"/>
+      </w:pPr>
+      <w:r>
+        <w:t>15. Suresh J, Kumar R, Hissar S, Shukla S, Vivekanandan K. Ocular toxicity associated with Ethambutol in the South-East Asia Region. Int Ophthalmol. 2026;46(1):251. doi:10.1007/s10792-026-04131-6.</w:t>
+      </w:r>
+    </w:p>
+    <w:p>
+      <w:pPr>
+        <w:spacing w:after="80"/>
+        <w:ind w:left="397" w:hanging="397"/>
+      </w:pPr>
+      <w:r>
+        <w:t>16. Fusaroli M, Salvo F, Begaud B, AlShammari TM, Bate A, Battini V, et al. The Reporting of a Disproportionality Analysis for Drug Safety Signal Detection Using Individual Case Safety Reports in PharmacoVigilance (READUS-PV): Development and Statement. Drug Saf. 2024;47(6):575-584. doi:10.1007/s40264-024-01421-9.</w:t>
+      </w:r>
+    </w:p>
+    <w:p>
+      <w:pPr>
+        <w:spacing w:after="80"/>
+        <w:ind w:left="397" w:hanging="397"/>
+      </w:pPr>
+      <w:r>
+        <w:t>17. Langan SM, Schmidt SA, Wing K, Ehrenstein V, Nicholls SG, Filion KB, et al. The reporting of studies conducted using observational routinely collected health data statement for pharmacoepidemiology (RECORD-PE). BMJ. 2018;363:k3532. doi:10.1136/bmj.k3532.</w:t>
+      </w:r>
+    </w:p>
+    <w:p>
+      <w:pPr>
+        <w:spacing w:after="80"/>
+        <w:ind w:left="397" w:hanging="397"/>
+      </w:pPr>
+      <w:r>
+        <w:t>18. Cheng HC, Wong YH, Wang AG, Chen SW, Yang YL, Juan HC, et al. Müller glia-mediated protection of retinal ganglion cells from ethambutol-induced neurotoxicity through brain-derived neurotrophic factor. Cell Commun Signal. 2025;23(1):474. doi:10.1186/s12964-025-02478-4.</w:t>
+      </w:r>
+    </w:p>
+    <w:p>
+      <w:pPr>
+        <w:spacing w:after="80"/>
+        <w:ind w:left="397" w:hanging="397"/>
+      </w:pPr>
+      <w:r>
+        <w:t>19. Li Q, Ge W, Zhang Y, Xu Q, Xu J, Zhang Y, et al. Ethambutol induces optic neuropathy through SDHB-mediated ferroptosis in retinal ganglion cells via Smad4 pathway. Hum Cell. 2026;39(2):37. doi:10.1007/s13577-025-01342-4.</w:t>
       </w:r>
     </w:p>
     <w:p>
       <w:r>
         <w:br w:type="page"/>
-      </w:r>
-    </w:p>
-    <w:p>
-      <w:r>
-        <w:rPr>
-          <w:b/>
-        </w:rPr>
-        <w:t>Figure 1</w:t>
       </w:r>
     </w:p>
     <w:p>
@@ -5603,15 +5878,18 @@
         </w:drawing>
       </w:r>
     </w:p>
-    <w:p/>
     <w:p>
       <w:r>
         <w:rPr>
           <w:b/>
         </w:rPr>
-        <w:t>Figure 2</w:t>
+        <w:t xml:space="preserve">Figure 1. </w:t>
+      </w:r>
+      <w:r>
+        <w:t>Case flow in the three spontaneous-reporting systems. FAERS releases were de-duplicated by case version; the ethambutol cohort was defined by any drug record naming the drug, and split by drug role. JADER and Canada Vigilance were analysed independently with the exposure definitions given in Table 1.</w:t>
       </w:r>
     </w:p>
+    <w:p/>
     <w:p>
       <w:r>
         <w:drawing>
@@ -5648,15 +5926,18 @@
         </w:drawing>
       </w:r>
     </w:p>
-    <w:p/>
     <w:p>
       <w:r>
         <w:rPr>
           <w:b/>
         </w:rPr>
-        <w:t>Figure 3</w:t>
+        <w:t xml:space="preserve">Figure 2. </w:t>
+      </w:r>
+      <w:r>
+        <w:t>The eleven ocular Standardised MedDRA Queries (narrow sets) in FAERS, ethambutol against all other de-duplicated reports. Points are reporting odds ratios with 95% confidence intervals on a logarithmic axis; the dashed line marks unity. Red, interval above unity; blue, interval below unity; grey, interval includes unity. The number of exposed cases is given at the right.</w:t>
       </w:r>
     </w:p>
+    <w:p/>
     <w:p>
       <w:r>
         <w:drawing>
@@ -5693,15 +5974,18 @@
         </w:drawing>
       </w:r>
     </w:p>
-    <w:p/>
     <w:p>
       <w:r>
         <w:rPr>
           <w:b/>
         </w:rPr>
-        <w:t>Figure 4</w:t>
+        <w:t xml:space="preserve">Figure 3. </w:t>
+      </w:r>
+      <w:r>
+        <w:t>Preferred terms within the optic-nerve query, alongside the pre-specified negative controls and the non-specific ocular comparators. Terms with fewer than three exposed cases are not plotted. Conventions as in Figure 2.</w:t>
       </w:r>
     </w:p>
+    <w:p/>
     <w:p>
       <w:r>
         <w:drawing>
@@ -5736,6 +6020,17 @@
             </a:graphic>
           </wp:inline>
         </w:drawing>
+      </w:r>
+    </w:p>
+    <w:p>
+      <w:r>
+        <w:rPr>
+          <w:b/>
+        </w:rPr>
+        <w:t xml:space="preserve">Figure 4. </w:t>
+      </w:r>
+      <w:r>
+        <w:t>Sensitivity of the optic-nerve estimate to exposure role and reporting period. The upper four rows compare the preferred term and the query under all-role and suspect-only exposure; the lower two split the cohort by receipt year at 2016. Conventions as in Figure 2.</w:t>
       </w:r>
     </w:p>
     <w:p/>

</xml_diff>

<commit_message>
Convert headings to four levels, drop markdown rules and suppress heading numbering in the Word manuscript
</commit_message>
<xml_diff>
--- a/submission/Ethambutol_TADS_manuscript.docx
+++ b/submission/Ethambutol_TADS_manuscript.docx
@@ -5,6 +5,10 @@
     <w:p>
       <w:pPr>
         <w:pStyle w:val="Heading1"/>
+        <w:numPr>
+          <w:ilvl w:val="0"/>
+          <w:numId w:val="0"/>
+        </w:numPr>
       </w:pPr>
       <w:r>
         <w:t>Optic-nerve-predominant adverse-event reporting with ethambutol: a multi-database pharmacovigilance study with exploratory transcriptomic analysis</w:t>
@@ -68,15 +72,11 @@
     </w:p>
     <w:p>
       <w:pPr>
-        <w:jc w:val="both"/>
-      </w:pPr>
-      <w:r>
-        <w:t>---</w:t>
-      </w:r>
-    </w:p>
-    <w:p>
-      <w:pPr>
         <w:pStyle w:val="Heading2"/>
+        <w:numPr>
+          <w:ilvl w:val="0"/>
+          <w:numId w:val="0"/>
+        </w:numPr>
       </w:pPr>
       <w:r>
         <w:t>Abstract</w:t>
@@ -196,15 +196,11 @@
     </w:p>
     <w:p>
       <w:pPr>
-        <w:jc w:val="both"/>
-      </w:pPr>
-      <w:r>
-        <w:t>---</w:t>
-      </w:r>
-    </w:p>
-    <w:p>
-      <w:pPr>
         <w:pStyle w:val="Heading2"/>
+        <w:numPr>
+          <w:ilvl w:val="0"/>
+          <w:numId w:val="0"/>
+        </w:numPr>
       </w:pPr>
       <w:r>
         <w:t>Plain Language Summary</w:t>
@@ -236,15 +232,11 @@
     </w:p>
     <w:p>
       <w:pPr>
-        <w:jc w:val="both"/>
-      </w:pPr>
-      <w:r>
-        <w:t>---</w:t>
-      </w:r>
-    </w:p>
-    <w:p>
-      <w:pPr>
         <w:pStyle w:val="Heading2"/>
+        <w:numPr>
+          <w:ilvl w:val="0"/>
+          <w:numId w:val="0"/>
+        </w:numPr>
       </w:pPr>
       <w:r>
         <w:t>1. Introduction</w:t>
@@ -293,6 +285,10 @@
     <w:p>
       <w:pPr>
         <w:pStyle w:val="Heading2"/>
+        <w:numPr>
+          <w:ilvl w:val="0"/>
+          <w:numId w:val="0"/>
+        </w:numPr>
       </w:pPr>
       <w:r>
         <w:t>2. Methods</w:t>
@@ -300,10 +296,14 @@
     </w:p>
     <w:p>
       <w:pPr>
-        <w:jc w:val="both"/>
+        <w:pStyle w:val="Heading3"/>
+        <w:numPr>
+          <w:ilvl w:val="0"/>
+          <w:numId w:val="0"/>
+        </w:numPr>
       </w:pPr>
       <w:r>
-        <w:t>### 2.1 Design and reporting</w:t>
+        <w:t>2.1 Design and reporting</w:t>
       </w:r>
     </w:p>
     <w:p>
@@ -324,10 +324,14 @@
     </w:p>
     <w:p>
       <w:pPr>
-        <w:jc w:val="both"/>
+        <w:pStyle w:val="Heading3"/>
+        <w:numPr>
+          <w:ilvl w:val="0"/>
+          <w:numId w:val="0"/>
+        </w:numPr>
       </w:pPr>
       <w:r>
-        <w:t>### 2.2 Data sources and period</w:t>
+        <w:t>2.2 Data sources and period</w:t>
       </w:r>
     </w:p>
     <w:p>
@@ -360,10 +364,14 @@
     </w:p>
     <w:p>
       <w:pPr>
-        <w:jc w:val="both"/>
+        <w:pStyle w:val="Heading3"/>
+        <w:numPr>
+          <w:ilvl w:val="0"/>
+          <w:numId w:val="0"/>
+        </w:numPr>
       </w:pPr>
       <w:r>
-        <w:t>### 2.3 Case de-duplication</w:t>
+        <w:t>2.3 Case de-duplication</w:t>
       </w:r>
     </w:p>
     <w:p>
@@ -414,10 +422,14 @@
     </w:p>
     <w:p>
       <w:pPr>
-        <w:jc w:val="both"/>
+        <w:pStyle w:val="Heading3"/>
+        <w:numPr>
+          <w:ilvl w:val="0"/>
+          <w:numId w:val="0"/>
+        </w:numPr>
       </w:pPr>
       <w:r>
-        <w:t>### 2.4 Exposure</w:t>
+        <w:t>2.4 Exposure</w:t>
       </w:r>
     </w:p>
     <w:p>
@@ -450,10 +462,14 @@
     </w:p>
     <w:p>
       <w:pPr>
-        <w:jc w:val="both"/>
+        <w:pStyle w:val="Heading3"/>
+        <w:numPr>
+          <w:ilvl w:val="0"/>
+          <w:numId w:val="0"/>
+        </w:numPr>
       </w:pPr>
       <w:r>
-        <w:t>### 2.5 Outcomes</w:t>
+        <w:t>2.5 Outcomes</w:t>
       </w:r>
     </w:p>
     <w:p>
@@ -484,10 +500,14 @@
     </w:p>
     <w:p>
       <w:pPr>
-        <w:jc w:val="both"/>
+        <w:pStyle w:val="Heading3"/>
+        <w:numPr>
+          <w:ilvl w:val="0"/>
+          <w:numId w:val="0"/>
+        </w:numPr>
       </w:pPr>
       <w:r>
-        <w:t>### 2.6 Disproportionality measures and signal definition</w:t>
+        <w:t>2.6 Disproportionality measures and signal definition</w:t>
       </w:r>
     </w:p>
     <w:p>
@@ -508,10 +528,14 @@
     </w:p>
     <w:p>
       <w:pPr>
-        <w:jc w:val="both"/>
+        <w:pStyle w:val="Heading3"/>
+        <w:numPr>
+          <w:ilvl w:val="0"/>
+          <w:numId w:val="0"/>
+        </w:numPr>
       </w:pPr>
       <w:r>
-        <w:t>### 2.7 Sensitivity analyses</w:t>
+        <w:t>2.7 Sensitivity analyses</w:t>
       </w:r>
     </w:p>
     <w:p>
@@ -532,10 +556,14 @@
     </w:p>
     <w:p>
       <w:pPr>
-        <w:jc w:val="both"/>
+        <w:pStyle w:val="Heading3"/>
+        <w:numPr>
+          <w:ilvl w:val="0"/>
+          <w:numId w:val="0"/>
+        </w:numPr>
       </w:pPr>
       <w:r>
-        <w:t>### 2.8 External replication</w:t>
+        <w:t>2.8 External replication</w:t>
       </w:r>
     </w:p>
     <w:p>
@@ -548,10 +576,14 @@
     </w:p>
     <w:p>
       <w:pPr>
-        <w:jc w:val="both"/>
+        <w:pStyle w:val="Heading3"/>
+        <w:numPr>
+          <w:ilvl w:val="0"/>
+          <w:numId w:val="0"/>
+        </w:numPr>
       </w:pPr>
       <w:r>
-        <w:t>### 2.9 Time to onset</w:t>
+        <w:t>2.9 Time to onset</w:t>
       </w:r>
     </w:p>
     <w:p>
@@ -564,10 +596,14 @@
     </w:p>
     <w:p>
       <w:pPr>
-        <w:jc w:val="both"/>
+        <w:pStyle w:val="Heading3"/>
+        <w:numPr>
+          <w:ilvl w:val="0"/>
+          <w:numId w:val="0"/>
+        </w:numPr>
       </w:pPr>
       <w:r>
-        <w:t>### 2.10 Exploratory transcriptomic reanalysis</w:t>
+        <w:t>2.10 Exploratory transcriptomic reanalysis</w:t>
       </w:r>
     </w:p>
     <w:p>
@@ -596,10 +632,14 @@
     </w:p>
     <w:p>
       <w:pPr>
-        <w:jc w:val="both"/>
+        <w:pStyle w:val="Heading3"/>
+        <w:numPr>
+          <w:ilvl w:val="0"/>
+          <w:numId w:val="0"/>
+        </w:numPr>
       </w:pPr>
       <w:r>
-        <w:t>### 2.11 Software and reproducibility</w:t>
+        <w:t>2.11 Software and reproducibility</w:t>
       </w:r>
     </w:p>
     <w:p>
@@ -633,6 +673,10 @@
     <w:p>
       <w:pPr>
         <w:pStyle w:val="Heading2"/>
+        <w:numPr>
+          <w:ilvl w:val="0"/>
+          <w:numId w:val="0"/>
+        </w:numPr>
       </w:pPr>
       <w:r>
         <w:t>3. Results</w:t>
@@ -640,10 +684,14 @@
     </w:p>
     <w:p>
       <w:pPr>
-        <w:jc w:val="both"/>
+        <w:pStyle w:val="Heading3"/>
+        <w:numPr>
+          <w:ilvl w:val="0"/>
+          <w:numId w:val="0"/>
+        </w:numPr>
       </w:pPr>
       <w:r>
-        <w:t>### 3.1 Case flow and cohort</w:t>
+        <w:t>3.1 Case flow and cohort</w:t>
       </w:r>
     </w:p>
     <w:p>
@@ -656,10 +704,14 @@
     </w:p>
     <w:p>
       <w:pPr>
-        <w:jc w:val="both"/>
+        <w:pStyle w:val="Heading3"/>
+        <w:numPr>
+          <w:ilvl w:val="0"/>
+          <w:numId w:val="0"/>
+        </w:numPr>
       </w:pPr>
       <w:r>
-        <w:t>### 3.2 The optic-nerve query stands out among the eleven ocular queries</w:t>
+        <w:t>3.2 The optic-nerve query stands out among the eleven ocular queries</w:t>
       </w:r>
     </w:p>
     <w:p>
@@ -688,10 +740,14 @@
     </w:p>
     <w:p>
       <w:pPr>
-        <w:jc w:val="both"/>
+        <w:pStyle w:val="Heading3"/>
+        <w:numPr>
+          <w:ilvl w:val="0"/>
+          <w:numId w:val="0"/>
+        </w:numPr>
       </w:pPr>
       <w:r>
-        <w:t>### 3.3 The terms driving the query, and the pre-specified controls</w:t>
+        <w:t>3.3 The terms driving the query, and the pre-specified controls</w:t>
       </w:r>
     </w:p>
     <w:p>
@@ -720,10 +776,14 @@
     </w:p>
     <w:p>
       <w:pPr>
-        <w:jc w:val="both"/>
+        <w:pStyle w:val="Heading3"/>
+        <w:numPr>
+          <w:ilvl w:val="0"/>
+          <w:numId w:val="0"/>
+        </w:numPr>
       </w:pPr>
       <w:r>
-        <w:t>### 3.4 Sensitivity: exposure role and reporting period</w:t>
+        <w:t>3.4 Sensitivity: exposure role and reporting period</w:t>
       </w:r>
     </w:p>
     <w:p>
@@ -760,10 +820,14 @@
     </w:p>
     <w:p>
       <w:pPr>
-        <w:jc w:val="both"/>
+        <w:pStyle w:val="Heading3"/>
+        <w:numPr>
+          <w:ilvl w:val="0"/>
+          <w:numId w:val="0"/>
+        </w:numPr>
       </w:pPr>
       <w:r>
-        <w:t>### 3.5 Replication in two independent national systems</w:t>
+        <w:t>3.5 Replication in two independent national systems</w:t>
       </w:r>
     </w:p>
     <w:p>
@@ -792,10 +856,14 @@
     </w:p>
     <w:p>
       <w:pPr>
-        <w:jc w:val="both"/>
+        <w:pStyle w:val="Heading3"/>
+        <w:numPr>
+          <w:ilvl w:val="0"/>
+          <w:numId w:val="0"/>
+        </w:numPr>
       </w:pPr>
       <w:r>
-        <w:t>### 3.6 Time to onset</w:t>
+        <w:t>3.6 Time to onset</w:t>
       </w:r>
     </w:p>
     <w:p>
@@ -808,10 +876,14 @@
     </w:p>
     <w:p>
       <w:pPr>
-        <w:jc w:val="both"/>
+        <w:pStyle w:val="Heading3"/>
+        <w:numPr>
+          <w:ilvl w:val="0"/>
+          <w:numId w:val="0"/>
+        </w:numPr>
       </w:pPr>
       <w:r>
-        <w:t>### 3.7 Exploratory transcriptomic reanalysis</w:t>
+        <w:t>3.7 Exploratory transcriptomic reanalysis</w:t>
       </w:r>
     </w:p>
     <w:p>
@@ -849,6 +921,10 @@
     <w:p>
       <w:pPr>
         <w:pStyle w:val="Heading2"/>
+        <w:numPr>
+          <w:ilvl w:val="0"/>
+          <w:numId w:val="0"/>
+        </w:numPr>
       </w:pPr>
       <w:r>
         <w:t>4. Discussion</w:t>
@@ -856,10 +932,14 @@
     </w:p>
     <w:p>
       <w:pPr>
-        <w:jc w:val="both"/>
+        <w:pStyle w:val="Heading3"/>
+        <w:numPr>
+          <w:ilvl w:val="0"/>
+          <w:numId w:val="0"/>
+        </w:numPr>
       </w:pPr>
       <w:r>
-        <w:t>### 4.1 Principal findings</w:t>
+        <w:t>4.1 Principal findings</w:t>
       </w:r>
     </w:p>
     <w:p>
@@ -872,10 +952,14 @@
     </w:p>
     <w:p>
       <w:pPr>
-        <w:jc w:val="both"/>
+        <w:pStyle w:val="Heading3"/>
+        <w:numPr>
+          <w:ilvl w:val="0"/>
+          <w:numId w:val="0"/>
+        </w:numPr>
       </w:pPr>
       <w:r>
-        <w:t>### 4.2 What this adds to previous work</w:t>
+        <w:t>4.2 What this adds to previous work</w:t>
       </w:r>
     </w:p>
     <w:p>
@@ -896,10 +980,14 @@
     </w:p>
     <w:p>
       <w:pPr>
-        <w:jc w:val="both"/>
+        <w:pStyle w:val="Heading3"/>
+        <w:numPr>
+          <w:ilvl w:val="0"/>
+          <w:numId w:val="0"/>
+        </w:numPr>
       </w:pPr>
       <w:r>
-        <w:t>### 4.3 Reporting bias, indication confounding, and what the controls do and do not show</w:t>
+        <w:t>4.3 Reporting bias, indication confounding, and what the controls do and do not show</w:t>
       </w:r>
     </w:p>
     <w:p>
@@ -920,10 +1008,14 @@
     </w:p>
     <w:p>
       <w:pPr>
-        <w:jc w:val="both"/>
+        <w:pStyle w:val="Heading3"/>
+        <w:numPr>
+          <w:ilvl w:val="0"/>
+          <w:numId w:val="0"/>
+        </w:numPr>
       </w:pPr>
       <w:r>
-        <w:t>### 4.4 Limits of the transcriptomic exploration</w:t>
+        <w:t>4.4 Limits of the transcriptomic exploration</w:t>
       </w:r>
     </w:p>
     <w:p>
@@ -936,10 +1028,14 @@
     </w:p>
     <w:p>
       <w:pPr>
-        <w:jc w:val="both"/>
+        <w:pStyle w:val="Heading3"/>
+        <w:numPr>
+          <w:ilvl w:val="0"/>
+          <w:numId w:val="0"/>
+        </w:numPr>
       </w:pPr>
       <w:r>
-        <w:t>### 4.5 Clinical and regulatory implications</w:t>
+        <w:t>4.5 Clinical and regulatory implications</w:t>
       </w:r>
     </w:p>
     <w:p>
@@ -968,10 +1064,14 @@
     </w:p>
     <w:p>
       <w:pPr>
-        <w:jc w:val="both"/>
+        <w:pStyle w:val="Heading3"/>
+        <w:numPr>
+          <w:ilvl w:val="0"/>
+          <w:numId w:val="0"/>
+        </w:numPr>
       </w:pPr>
       <w:r>
-        <w:t>### 4.6 Conclusion</w:t>
+        <w:t>4.6 Conclusion</w:t>
       </w:r>
     </w:p>
     <w:p>
@@ -985,6 +1085,10 @@
     <w:p>
       <w:pPr>
         <w:pStyle w:val="Heading2"/>
+        <w:numPr>
+          <w:ilvl w:val="0"/>
+          <w:numId w:val="0"/>
+        </w:numPr>
       </w:pPr>
       <w:r>
         <w:t>Statements and Declarations</w:t>
@@ -1139,6 +1243,10 @@
     <w:p>
       <w:pPr>
         <w:pStyle w:val="Heading2"/>
+        <w:numPr>
+          <w:ilvl w:val="0"/>
+          <w:numId w:val="0"/>
+        </w:numPr>
       </w:pPr>
       <w:r>
         <w:t>Figure legends</w:t>
@@ -1203,6 +1311,10 @@
     <w:p>
       <w:pPr>
         <w:pStyle w:val="Heading2"/>
+        <w:numPr>
+          <w:ilvl w:val="0"/>
+          <w:numId w:val="0"/>
+        </w:numPr>
       </w:pPr>
       <w:r>
         <w:t>Tables</w:t>
@@ -5661,6 +5773,10 @@
     <w:p>
       <w:pPr>
         <w:pStyle w:val="Heading2"/>
+        <w:numPr>
+          <w:ilvl w:val="0"/>
+          <w:numId w:val="0"/>
+        </w:numPr>
       </w:pPr>
       <w:r>
         <w:t>References</w:t>

</xml_diff>

<commit_message>
Verify every reported number against the results file and tighten five methodological statements
Adds a consistency checker over the results file, PDF, Word tables and supplement; states what the eleven-query comparison can support; moves the exposure-identification limit into the discussion with its two consequences; ties the onset medians to their analysable subset; names the fixed-regimen analysis a within-class reporting contrast; aligns the ferroptosis verdict; fixes GSE318912 to the AC16 line in Results.
</commit_message>
<xml_diff>
--- a/submission/Ethambutol_TADS_manuscript.docx
+++ b/submission/Ethambutol_TADS_manuscript.docx
@@ -719,7 +719,7 @@
         <w:jc w:val="both"/>
       </w:pPr>
       <w:r>
-        <w:t>Across the eleven ocular queries, the optic-nerve query returned the highest reporting odds ratio, 23.51 (95% CI 21.35–25.89) on 432 exposed cases, 5.7 times the next highest point estimate (Figure 2, Table 2). The two estimates are not formally compared, and the ratio is reported as a description of the ordering rather than as a test of their difference. Four queries lay significantly above unity — optic nerve 23.51, ocular infections 4.13, retinal 2.18 and ocular motility 2.02 — three lay significantly below it (glaucoma 0.45, lacrimal 0.24, periorbital and eyelid 0.48), and four were null (lens 1.18, corneal 1.08, conjunctival 0.95, scleral 0.88). The queries covering the ocular surface and anterior segment therefore showed no excess, while the query covering the optic nerve showed the largest one.</w:t>
+        <w:t>Across the eleven ocular queries, the optic-nerve query returned the highest reporting odds ratio, 23.51 (95% CI 21.35–25.89) on 432 exposed cases, 5.7 times the next highest point estimate (Figure 2, Table 2). The two estimates are not formally compared; the ratio describes the ordering rather than testing a difference. Four queries lay significantly above unity — optic nerve 23.51, ocular infections 4.13, retinal 2.18 and ocular motility 2.02 — three lay significantly below it (glaucoma 0.45, lacrimal 0.24, periorbital and eyelid 0.48), and four were null (lens 1.18, corneal 1.08, conjunctival 0.95, scleral 0.88). The queries covering the ocular surface and anterior segment therefore showed no excess, while the query covering the optic nerve showed the largest one.</w:t>
       </w:r>
     </w:p>
     <w:p>
@@ -899,7 +899,7 @@
         <w:jc w:val="both"/>
       </w:pPr>
       <w:r>
-        <w:t>Three mechanisms moved in the direction their published accounts predict, at gene-set level. The NRF2 antioxidant programme was the strongest: NFE2L2 itself rose 1.02 log2 and its targets — HMOX1 (+0.98), GCLM (+0.95), TXNRD1, SRXN1, NQO1, SQSTM1 and FTH1 — moved with it, seven of the ten genes significantly, for a mean of +1.045. The autophagy receptors accumulated (SQSTM1 +1.42, MAP1LC3B +1.03; mean +0.797), a pattern compatible with an altered autophagy-associated response, although transcript levels do not establish autophagic flux, and the respiratory-chain subunits fell (mean −0.272, four of twelve significant).</w:t>
+        <w:t>Three mechanisms moved in the direction their published accounts predict, at gene-set level. The NRF2 antioxidant programme was the strongest: NFE2L2 rose 1.02 log2 and its targets (HMOX1 +0.98, GCLM +0.95, with TXNRD1, SRXN1, NQO1, SQSTM1 and FTH1) moved with it, seven of the ten significantly, mean +1.045. The autophagy receptors accumulated (SQSTM1 +1.42, MAP1LC3B +1.03; mean +0.797), a pattern compatible with an altered autophagy-associated response, although transcript levels do not establish autophagic flux, and the respiratory-chain subunits fell (mean −0.272, four of twelve significant).</w:t>
       </w:r>
     </w:p>
     <w:p>
@@ -907,7 +907,7 @@
         <w:jc w:val="both"/>
       </w:pPr>
       <w:r>
-        <w:t>Two other accounts did not behave as predicted. The ferroptosis account predicts SLC7A11 and GPX4 falling; their transcripts rose, SLC7A11 by 3.80 log2, while the iron-handling genes TFRC (+2.00) and FTH1 (+0.31) rose as that account also predicts. The zinc-chelation account was tested against an empirical reference, a TPEN-treated human cell line (GSE318912): TPEN lowered metallothionein (mean −0.17) and raised the SLC39A importers (+0.33), whereas ethambutol raised metallothionein (+0.31) and left the importers unchanged (+0.04), and the two fold-change vectors correlated at r = +0.07 across the 12,201 genes both experiments measured. The two experiments used different cell types, so that correlation bounds rather than settles the comparison.</w:t>
+        <w:t>Two other accounts did not behave as predicted. The ferroptosis account predicts SLC7A11 and GPX4 falling; their transcripts rose, SLC7A11 by 3.80 log2, while the iron-handling genes TFRC (+2.00) and FTH1 (+0.31) rose as that account also predicts. The zinc-chelation account was tested against an empirical reference, the TPEN-treated AC16 cardiomyocyte line (GSE318912): TPEN lowered metallothionein (mean −0.17) and raised the SLC39A importers (+0.33), whereas ethambutol raised metallothionein (+0.31) and left the importers unchanged (+0.04), and the two fold-change vectors correlated at r = +0.07 across the 12,201 genes both measured; different cell types and an unpaired design bound what that correlation shows.</w:t>
       </w:r>
     </w:p>
     <w:p>
@@ -915,7 +915,7 @@
         <w:jc w:val="both"/>
       </w:pPr>
       <w:r>
-        <w:t>None of this establishes a mechanism in patients. The predictions were assembled from the literature rather than fixed before our own data were examined, there is no protein measurement, no genotype and no microglial or Müller glial compartment in the preparation, and the concentration is far above therapeutic exposure. What it does show is that selected transcriptional predictions of the ferroptosis account were not reproduced under these conditions, which is a weaker statement than a refutation and is reported as such.</w:t>
+        <w:t>None of this establishes a mechanism in patients: the predictions were assembled from the literature after our data were examined, there is no protein measurement, no genotype and no glial compartment, and the concentration is far above therapeutic exposure. What it shows is that selected ferroptosis predictions were not reproduced here, which is weaker than a refutation and is reported as such.</w:t>
       </w:r>
     </w:p>
     <w:p>
@@ -967,7 +967,7 @@
         <w:jc w:val="both"/>
       </w:pPr>
       <w:r>
-        <w:t>That ethambutol is associated with optic neuropathy is not new, and the finding that its ocular signal is prominent has been reported before [14]. The contribution here is the internal contrast. Previous pharmacovigilance analyses of these drugs reported signal counts aggregated to system organ class [14] or organised the ocular phenotype by organ-system grouping [15]; in either design, a drug that produces a specific optic-nerve injury and a drug that produces a general increase in ocular reporting look alike. Testing the eleven ocular queries against one another, with the optic-nerve query nominated in advance and with pre-specified non-specific terms as controls, separates those two possibilities within the same reports. The optic-nerve-related reporting signal was observed in all three systems, but the evidence was not equivalent across databases. FAERS provided the primary comparison across eleven ocular queries and the pre-specified term-level controls, while JADER provided term-level external support for the mapped terms. Canada Vigilance showed a directionally consistent signal using a broader, study-specific string-matched composite, rather than an equivalent replication of the primary query or of its internal-control pattern. The contrast is less consistent with a uniform increase across all ocular reporting than a single organ-system count would be, but it does not remove differential recognition and coding of suspected toxicity, which remains the main alternative explanation for the pattern.</w:t>
+        <w:t>That ethambutol is associated with optic neuropathy is not new, and its prominent ocular signal has been reported before [14]. The contribution here is the internal contrast. Previous pharmacovigilance analyses of these drugs reported signal counts aggregated to system organ class [14] or organised the ocular phenotype by organ-system grouping [15]; in either design, a drug that produces a specific optic-nerve injury and a drug that produces a general increase in ocular reporting look alike. Testing the eleven ocular queries against one another, with the optic-nerve query nominated in advance and with pre-specified non-specific terms as controls, separates those two possibilities within the same reports. The optic-nerve signal appeared in all three systems, but at different evidential levels: FAERS carried the eleven-query comparison and the term-level controls, JADER gave term-level support for the mapped terms, and Canada Vigilance only a broader string-matched composite. That contrast is less consistent with a uniform increase across all ocular reporting, but it does not remove differential recognition and coding, which remains the main alternative explanation.</w:t>
       </w:r>
     </w:p>
     <w:p>
@@ -995,7 +995,7 @@
         <w:jc w:val="both"/>
       </w:pPr>
       <w:r>
-        <w:t>Spontaneous reporting has no denominator, and under-reporting is substantial and non-random. Three biases are relevant, and they act differently on the main result. Notoriety bias — increased reporting of a known adverse effect — raises the absolute ocular signal but does not by itself produce a contrast between optic-nerve terms and cataract, dry eye or glaucoma, because all of them sit in the same reports. Sharing a database and an exposure definition does, however, not make every reporting bias common to all outcomes: a clinician who already suspects ethambutol toxicity may record the optic-nerve diagnosis precisely and leave a visual complaint uncoded. The comparison narrows the range of explanations; it does not eliminate outcome-specific reporting. Differential coding is the more serious concern: clinicians who suspect ethambutol toxicity may code optic neuropathy more precisely than they code a non-specific complaint, which would concentrate the signal in the optic-nerve terms without any difference in underlying incidence. Indication confounding acts in the opposite direction, inflating the ocular signal as a whole; the elevation of the ocular infections query is the clearest example: it may partly reflect confounding by indication and channelling, including the underlying ocular infection, rather than a direct drug effect.</w:t>
+        <w:t>Spontaneous reporting has no denominator, and under-reporting is substantial and non-random. Three biases are relevant, and they act differently on the main result. Notoriety bias — increased reporting of a known adverse effect — raises the absolute ocular signal but does not by itself produce a contrast between optic-nerve terms and cataract, dry eye or glaucoma, because all of them sit in the same reports. Sharing a database and an exposure definition does not, however, make every bias common to all outcomes: the clinician who suspects ethambutol toxicity may code the optic-nerve diagnosis precisely and leave a visual complaint uncoded. The comparison narrows the range of explanations; it does not eliminate outcome-specific reporting. Differential coding is the more serious concern: clinicians who suspect ethambutol toxicity may code optic neuropathy more precisely than they code a non-specific complaint, which would concentrate the signal in the optic-nerve terms without any difference in underlying incidence. Indication confounding acts in the opposite direction, inflating the ocular signal as a whole; the elevation of the ocular infections query is the clearest example: it may partly reflect confounding by indication and channelling, including the underlying ocular infection, rather than a direct drug effect.</w:t>
       </w:r>
     </w:p>
     <w:p>
@@ -1003,7 +1003,7 @@
         <w:jc w:val="both"/>
       </w:pPr>
       <w:r>
-        <w:t>The controls bound the conclusion in both directions. The four negative-control terms did not show positive disproportionality signals, whereas the non-specific comparators were not uniformly null: eye pain was below unity, but vision blurred showed a modest elevation (1.50, 1.28–1.76). The absence of comparable elevations for the negative-control terms is less consistent with a uniform increase in ocular reporting. The vision-blurred signal, and the possibility of outcome-specific recognition and coding, mean that the internal contrast cannot establish anatomical specificity or exclude reporting bias. It also does not show that the negative-control events are not caused by the drug: a true effect that is small relative to background reporting would not appear. The result is a statement about the shape of the reporting signal, not a toxicity profile. Restriction to suspect-drug reports and the period split change the size of the estimate without changing its direction. The fixed-regimen contrast — rifampicin, isoniazid and pyrazinamide with versus without ethambutol — holds the background regimen constant but rests on a small unexposed group, and its interval includes unity; it is reported for completeness rather than as evidence of a within-class effect.</w:t>
+        <w:t>What the comparison supports is narrower than a ranking of ocular toxicity. The eleven queries are not independent: preferred terms belong to more than one of them, the background frequency of each condition differs in the underlying population, and the disease mix of the reports is not the same across queries. An ordering of odds ratios is therefore a description of the reporting signal, not a test that ethambutol affects one ocular structure more than another; no contrast between queries was tested. The controls bound the conclusion in both directions. The four negative-control terms did not show positive disproportionality signals, whereas the non-specific comparators were not uniformly null: eye pain was below unity, but vision blurred showed a modest elevation (1.50, 1.28–1.76). The absence of comparable elevations for the negative-control terms is less consistent with a uniform increase in ocular reporting. The vision-blurred signal, and the possibility of outcome-specific recognition and coding, mean that the internal contrast cannot establish anatomical specificity or exclude reporting bias. It also does not show that the negative-control events are not caused by the drug: a true effect that is small relative to background reporting would not appear. The result is a statement about the shape of the reporting signal, not a toxicity profile. Restriction to suspect-drug reports and the period split change the size of the estimate without changing its direction. The fixed-regimen analysis — rifampicin, isoniazid and pyrazinamide with versus without ethambutol — holds the background regimen constant but is a within-class reporting contrast, not a matched cohort: treatment duration, dose, disease severity and co-medication are not held constant, and the denominator is reports rather than treated patients. It rests on a small unexposed group and its interval includes unity, so it is reported for completeness rather than as evidence of a within-class effect.</w:t>
       </w:r>
     </w:p>
     <w:p>
@@ -1023,7 +1023,7 @@
         <w:jc w:val="both"/>
       </w:pPr>
       <w:r>
-        <w:t>The transcriptomic reanalysis was included because the mechanisms proposed for this toxicity make directional predictions that can be checked in human cells, not because it can resolve the mechanism. Three limits are decisive for how it should be read. The exposure was 8 mM for 24 hours, 330 to 800 times the peak plasma concentration at standard dosage, so the experiment models an acute millimolar insult rather than the months of therapeutic exposure over which the clinical toxicity develops. The preparation is a monoculture of retinal ganglion-like cells, so any contribution from microglia, Müller glia or the retinal vasculature is invisible to it. And the predictions were assembled from the published literature after the data were in hand, so the analysis is exploratory in the strict sense: it can generate hypotheses, and it can show that a predicted direction was not observed, but it cannot confirm or refute a mechanism operating in patients. The antioxidant, autophagic and oxidative-phosphorylation programmes moved in the predicted directions; the ferroptosis account [19] predicted a fall in SLC7A11 and GPX4 and their transcripts rose, so the appropriate conclusion is that selected transcriptional predictions were not reproduced under these conditions, not that ferroptosis has been excluded.</w:t>
+        <w:t>The transcriptomic reanalysis was included because the mechanisms proposed for this toxicity make directional predictions that can be checked in human cells, not because it can resolve the mechanism. Three limits are decisive for how it should be read. The exposure was 8 mM for 24 hours, 330 to 800 times the peak plasma concentration at standard dosage, so the experiment models an acute millimolar insult rather than the months of therapeutic exposure over which the clinical toxicity develops. The preparation is a monoculture of retinal ganglion-like cells, so contributions from microglia, Müller glia or the retinal vasculature are invisible to it, and the predictions were assembled after the data were in hand, so the analysis can show that a predicted direction was not observed but cannot confirm or refute a mechanism operating in patients. The antioxidant, autophagic and oxidative-phosphorylation programmes moved in the predicted directions; the ferroptosis account [19] predicted a fall in SLC7A11 and GPX4 and their transcripts rose, so the appropriate conclusion is that the data provide no consistent transcriptional support for the ferroptosis prediction under these conditions; they do not exclude ferroptosis, and they cannot, because transcript levels are not a flux measurement.</w:t>
       </w:r>
     </w:p>
     <w:p>
@@ -1043,7 +1043,7 @@
         <w:jc w:val="both"/>
       </w:pPr>
       <w:r>
-        <w:t>The practical value of a reporting signal of this shape is that it identifies where to look, and it should be read as a reason for clinical vigilance rather than as a basis for a screening schedule. Ethambutol optic neuropathy is managed by stopping the drug, and the damage becomes irreversible once atrophy is established, so detection before that point is what matters. In these data the reported time to onset had a median of 125 days, with 11.0% of optic-nerve events reported within 30 days of starting treatment and 23.2% within 60 days. That median comes from the 17-term case-level definition and the 83 reports with complete dates, not from the 432-case query, and it describes reports with complete dates rather than the incidence we would see in a monitored cohort: reports are a selected subset, the date of onset is recorded retrospectively, and no examinations that were not performed can appear in it. It is therefore consistent with a baseline examination and an early first follow-up, and with the clinical literature in which structural measures predict visual outcome better than initial acuity [10,11,12,13], but it cannot set the interval, and we do not derive one from it.</w:t>
+        <w:t>The practical value of a reporting signal of this shape is that it identifies where to look, and it should be read as a reason for clinical vigilance rather than as a basis for a screening schedule. Ethambutol optic neuropathy is managed by stopping the drug, and the damage becomes irreversible once atrophy is established, so detection before that point is what matters. In these data the reported time to onset had a median of 125 days, with 11.0% of optic-nerve events reported within 30 days of starting treatment and 23.2% within 60 days. That median comes from the 17-term case-level definition and the 83 reports with complete dates, not from the 432-case query, and it describes reports with complete dates rather than the incidence we would see in a monitored cohort: reports are a selected subset, the date of onset is recorded retrospectively, and no examinations that were not performed can appear in it. It is therefore consistent with a baseline examination and an early first follow-up, and with the clinical literature in which structural measures predict visual outcome better than initial acuity [10,11,12,13], but it cannot set the interval, and we do not derive one from it. Two further limits apply to these dates. Reports with an incomplete date pair are excluded, and their exclusion is unlikely to be random: a report that records both the start of therapy and the date of the event is one where the timing mattered to the reporter, which probably enriches the subset for events the reporter had already connected to the drug. And the definition used here is the 17-term case-level one, not the 45-term query, so the medians describe that subset rather than the main analysis.</w:t>
       </w:r>
     </w:p>
     <w:p>
@@ -1051,7 +1051,7 @@
         <w:jc w:val="both"/>
       </w:pPr>
       <w:r>
-        <w:t>For regulators and for those who build pharmacovigilance workflows, the transferable point is methodological. The use of pre-specified MedDRA queries and ocular comparators provides a structured assessment of whether disproportionality is uniform across ocular outcomes. It cannot exclude outcome-specific recognition and coding of suspected toxicity. The same design can be applied to other drugs with a suspected site-specific toxicity, and it requires no data beyond what spontaneous reporting systems already publish.</w:t>
+        <w:t>For regulators and those who build pharmacovigilance workflows, the transferable point is methodological: pre-specified MedDRA queries and ocular comparators give a structured assessment of whether disproportionality is uniform across ocular outcomes, without excluding outcome-specific recognition and coding. The design applies to any drug with a suspected site-specific toxicity and needs no data beyond what reporting systems publish.</w:t>
       </w:r>
     </w:p>
     <w:p>
@@ -1059,7 +1059,7 @@
         <w:jc w:val="both"/>
       </w:pPr>
       <w:r>
-        <w:t>Two designs would move the question forward, and neither can be built from spontaneous reports. A prospective cohort with protocolised baseline and interval ophthalmic assessment — optical coherence tomography and visual field testing, with the examination schedule fixed in advance rather than triggered by symptoms — would give both an incidence and the detection window. A record-linkage study of prescription data to incident optic-neuropathy diagnoses, with renal function and dose as covariates, would test the exposure–response relationship that a reporting database cannot address.</w:t>
+        <w:t>Exposure identification carries its own limits. FAERS exposure rests on a single token in the drug-name fields, and brand and salt variants were not added to it, so a report naming only a brand product is missed; the three systems also identify exposure differently, from a drug-name substring, a suspect-drug code and an ingredient table. Two consequences follow: the ethambutol cohort is probably incomplete in a way that varies by system, and the cross-database results should be read as agreement in direction and pattern rather than as comparable odds ratios. Two designs would move the question forward, and neither can be built from spontaneous reports. A prospective cohort with protocolised baseline and interval ophthalmic assessment — optical coherence tomography and visual field testing, with the examination schedule fixed in advance rather than triggered by symptoms — would give both an incidence and the detection window. A record-linkage study of prescription data to incident optic-neuropathy diagnoses, with renal function and dose as covariates, would test the exposure–response relationship that a reporting database cannot address.</w:t>
       </w:r>
     </w:p>
     <w:p>

</xml_diff>

<commit_message>
Compress the main text to 5,796 words and rewrite the Plain Language Summary ending
Cuts only repeated caveats and duplicated summaries; the Plain Language Summary now asks for vigilance and existing monitoring guidance rather than implying a tested follow-up window. Adds a check that figures 2-3, table 3 and the supplement agree with the results file.
</commit_message>
<xml_diff>
--- a/submission/Ethambutol_TADS_manuscript.docx
+++ b/submission/Ethambutol_TADS_manuscript.docx
@@ -227,7 +227,7 @@
         <w:jc w:val="both"/>
       </w:pPr>
       <w:r>
-        <w:t>Reports of side effects cannot tell us how many people are actually harmed, and they are influenced by which side effects doctors recognise and choose to report. What they can show is a consistent pattern across countries. That pattern supports watching vision carefully in people taking ethambutol, especially in the first months of treatment.</w:t>
+        <w:t>Reports of side effects cannot tell us how many people are actually harmed, and they are influenced by which side effects doctors recognise and choose to report. What they can show is a consistent pattern across countries. What the pattern supports is vigilance rather than a timetable: clinicians should ask about and watch for visual symptoms in people taking ethambutol and follow existing clinical guidance on monitoring. This study did not test any particular follow-up interval, and the 125-day median describes reports with complete dates, not the point at which damage usually begins.</w:t>
       </w:r>
     </w:p>
     <w:p>
@@ -719,7 +719,7 @@
         <w:jc w:val="both"/>
       </w:pPr>
       <w:r>
-        <w:t>Across the eleven ocular queries, the optic-nerve query returned the highest reporting odds ratio, 23.51 (95% CI 21.35–25.89) on 432 exposed cases, 5.7 times the next highest point estimate (Figure 2, Table 2). The two estimates are not formally compared; the ratio describes the ordering rather than testing a difference. Four queries lay significantly above unity — optic nerve 23.51, ocular infections 4.13, retinal 2.18 and ocular motility 2.02 — three lay significantly below it (glaucoma 0.45, lacrimal 0.24, periorbital and eyelid 0.48), and four were null (lens 1.18, corneal 1.08, conjunctival 0.95, scleral 0.88). The queries covering the ocular surface and anterior segment therefore showed no excess, while the query covering the optic nerve showed the largest one.</w:t>
+        <w:t>Across the eleven ocular queries, the optic-nerve query returned the highest reporting odds ratio, 23.51 (95% CI 21.35–25.89) on 432 exposed cases, 5.7 times the next highest point estimate (Figure 2, Table 2). The two estimates are not formally compared; the ratio describes the ordering rather than testing a difference. Four queries lay significantly above unity — optic nerve 23.51, ocular infections 4.13, retinal 2.18 and ocular motility 2.02 — three lay significantly below it (glaucoma 0.45, lacrimal 0.24, periorbital and eyelid 0.48), and four were null (lens 1.18, corneal 1.08, conjunctival 0.95, scleral 0.88).</w:t>
       </w:r>
     </w:p>
     <w:p>
@@ -871,7 +871,7 @@
         <w:jc w:val="both"/>
       </w:pPr>
       <w:r>
-        <w:t>Time from starting ethambutol to the reported event could be computed in 2,446 of the 15,510 ethambutol cases (15.8%). In this analysis an optic-nerve event was defined by the case-level term list (17 preferred terms, supplementary Table S9), which is wider than the 45-term query: 472 cases carried at least one of those terms and 83 had a usable interval, against 2,289 cases in the non-ocular group. The absolute number is therefore not comparable with the 432 exposed cases of the query, which use a different term set. Ocular events as a whole numbered 157, of which 83 were optic-nerve and 74 were other ocular events; that group had a median of 113 days (IQR 38–287), and the primary comparison reported here is optic-nerve against non-ocular events. Median interval was 125 days (IQR 63–293) for optic-nerve events and 33 days (IQR 10–100) for non-ocular events. The remaining 13,064 cases (84.2%) lacked a therapy start date, an event date, or an interval within the accepted range, so the analysis rests on the subset with complete dates and that subset is defined by completeness rather than by sampling.</w:t>
+        <w:t>Time from starting ethambutol to the reported event could be computed in 2,446 of the 15,510 ethambutol cases (15.8%). In this analysis an optic-nerve event was defined by the case-level term list (17 preferred terms, supplementary Table S9), which is wider than the 45-term query: 472 cases carried at least one of those terms and 83 had a usable interval, against 2,289 cases in the non-ocular group. The absolute number is therefore not comparable with the 432 exposed cases of the query. Ocular events as a whole numbered 157, of which 83 were optic-nerve and 74 were other ocular events; that group had a median of 113 days (IQR 38–287), and the primary comparison reported here is optic-nerve against non-ocular events. Median interval was 125 days (IQR 63–293) for optic-nerve events and 33 days (IQR 10–100) for non-ocular events. The remaining 13,064 cases (84.2%) lacked a therapy start date, an event date, or an interval within the accepted range, so the analysis rests on the subset with complete dates and that subset is defined by completeness rather than by sampling.</w:t>
       </w:r>
     </w:p>
     <w:p>
@@ -899,7 +899,7 @@
         <w:jc w:val="both"/>
       </w:pPr>
       <w:r>
-        <w:t>Three mechanisms moved in the direction their published accounts predict, at gene-set level. The NRF2 antioxidant programme was the strongest: NFE2L2 rose 1.02 log2 and its targets (HMOX1 +0.98, GCLM +0.95, with TXNRD1, SRXN1, NQO1, SQSTM1 and FTH1) moved with it, seven of the ten significantly, mean +1.045. The autophagy receptors accumulated (SQSTM1 +1.42, MAP1LC3B +1.03; mean +0.797), a pattern compatible with an altered autophagy-associated response, although transcript levels do not establish autophagic flux, and the respiratory-chain subunits fell (mean −0.272, four of twelve significant).</w:t>
+        <w:t>Three mechanisms moved in the direction their published accounts predict, at gene-set level. The NRF2 antioxidant programme was the strongest: NFE2L2 rose 1.02 log2 and its targets (HMOX1 +0.98, GCLM +0.95, with TXNRD1, SRXN1, NQO1, SQSTM1 and FTH1) moved with it, seven of the ten significantly, mean +1.045. The autophagy receptors accumulated (SQSTM1 +1.42, MAP1LC3B +1.03; mean +0.797), compatible with an altered autophagy-associated response without establishing flux, and the respiratory-chain subunits fell (mean −0.272, four of twelve significant).</w:t>
       </w:r>
     </w:p>
     <w:p>
@@ -907,7 +907,7 @@
         <w:jc w:val="both"/>
       </w:pPr>
       <w:r>
-        <w:t>Two other accounts did not behave as predicted. The ferroptosis account predicts SLC7A11 and GPX4 falling; their transcripts rose, SLC7A11 by 3.80 log2, while the iron-handling genes TFRC (+2.00) and FTH1 (+0.31) rose as that account also predicts. The zinc-chelation account was tested against an empirical reference, the TPEN-treated AC16 cardiomyocyte line (GSE318912): TPEN lowered metallothionein (mean −0.17) and raised the SLC39A importers (+0.33), whereas ethambutol raised metallothionein (+0.31) and left the importers unchanged (+0.04), and the two fold-change vectors correlated at r = +0.07 across the 12,201 genes both measured; different cell types and an unpaired design bound what that correlation shows.</w:t>
+        <w:t>Two other accounts did not behave as predicted. The ferroptosis account predicts SLC7A11 and GPX4 falling; both rose, SLC7A11 by 3.80 log2, as did the iron-handling genes TFRC and FTH1, which that account also predicts. The zinc-chelation account was tested against an empirical reference, the TPEN-treated AC16 cardiomyocyte line (GSE318912): TPEN lowered metallothionein (−0.17) and raised the SLC39A importers (+0.33), whereas ethambutol raised metallothionein (+0.31) and left the importers unchanged (+0.04); the two fold-change vectors correlated at r = +0.07 across the 12,201 genes both measured, a correlation bounded by the different cell types and the unpaired design.</w:t>
       </w:r>
     </w:p>
     <w:p>
@@ -947,7 +947,7 @@
         <w:jc w:val="both"/>
       </w:pPr>
       <w:r>
-        <w:t>In 15,510 de-duplicated ethambutol cases drawn from 20.7 million FAERS cases, the ocular reporting disproportion was concentrated in the optic-nerve query: it was the highest of the eleven ocular queries tested on MedDRA's own terms, at 23.51 against 4.13 for the next, and the queries covering the ocular surface and anterior segment were at or below background. Within the query the evidence rested on optic neuropathy and optic neuritis, the two terms with the largest numbers of exposed cases, rather than on the terms with the largest ratios. The optic-nerve-related signal was also observed in JADER, and in Canada Vigilance under a broader string-matched definition; the systems differ in reporters, in the coding of suspect drugs and in reporting culture. The non-specific term contrast was reproduced in FAERS and, for the mapped terms, JADER, whereas Canada Vigilance provided supporting evidence only for the optic-nerve signal. Median time to an optic-nerve event was 125 days, against 33 days for non-ocular events in the same case set.</w:t>
+        <w:t>In 15,510 de-duplicated ethambutol cases drawn from 20.7 million FAERS cases, the ocular reporting disproportion was concentrated in the optic-nerve query: it was the highest of the eleven ocular queries tested on MedDRA's own terms, at 23.51 against 4.13 for the next, and the queries covering the ocular surface and anterior segment were at or below background. Within the query the evidence rested on optic neuropathy and optic neuritis, the terms with the largest numbers of exposed cases rather than the largest ratios. The optic-nerve-related signal was also observed in JADER, and in Canada Vigilance under a broader string-matched definition; the systems differ in reporters, in the coding of suspect drugs and in reporting culture. The non-specific term contrast was reproduced in FAERS and, for the mapped terms, JADER, whereas Canada Vigilance provided supporting evidence only for the optic-nerve signal. Median time to an optic-nerve event was 125 days, against 33 days for non-ocular events in the same case set.</w:t>
       </w:r>
     </w:p>
     <w:p>
@@ -967,7 +967,7 @@
         <w:jc w:val="both"/>
       </w:pPr>
       <w:r>
-        <w:t>That ethambutol is associated with optic neuropathy is not new, and its prominent ocular signal has been reported before [14]. The contribution here is the internal contrast. Previous pharmacovigilance analyses of these drugs reported signal counts aggregated to system organ class [14] or organised the ocular phenotype by organ-system grouping [15]; in either design, a drug that produces a specific optic-nerve injury and a drug that produces a general increase in ocular reporting look alike. Testing the eleven ocular queries against one another, with the optic-nerve query nominated in advance and with pre-specified non-specific terms as controls, separates those two possibilities within the same reports. The optic-nerve signal appeared in all three systems, but at different evidential levels: FAERS carried the eleven-query comparison and the term-level controls, JADER gave term-level support for the mapped terms, and Canada Vigilance only a broader string-matched composite. That contrast is less consistent with a uniform increase across all ocular reporting, but it does not remove differential recognition and coding, which remains the main alternative explanation.</w:t>
+        <w:t>That ethambutol is associated with optic neuropathy is not new, and its prominent ocular signal has been reported before [14]. The contribution here is the internal contrast. Previous pharmacovigilance analyses of these drugs reported signal counts aggregated to system organ class [14] or organised the ocular phenotype by organ-system grouping [15]; in either design a specific optic-nerve injury and a general increase in ocular reporting look alike. Testing the eleven ocular queries against one another, with the optic-nerve query nominated in advance and with pre-specified non-specific terms as controls, separates those two possibilities within the same reports. The optic-nerve signal appeared in all three systems, at different evidential levels.</w:t>
       </w:r>
     </w:p>
     <w:p>
@@ -995,7 +995,7 @@
         <w:jc w:val="both"/>
       </w:pPr>
       <w:r>
-        <w:t>Spontaneous reporting has no denominator, and under-reporting is substantial and non-random. Three biases are relevant, and they act differently on the main result. Notoriety bias — increased reporting of a known adverse effect — raises the absolute ocular signal but does not by itself produce a contrast between optic-nerve terms and cataract, dry eye or glaucoma, because all of them sit in the same reports. Sharing a database and an exposure definition does not, however, make every bias common to all outcomes: the clinician who suspects ethambutol toxicity may code the optic-nerve diagnosis precisely and leave a visual complaint uncoded. The comparison narrows the range of explanations; it does not eliminate outcome-specific reporting. Differential coding is the more serious concern: clinicians who suspect ethambutol toxicity may code optic neuropathy more precisely than they code a non-specific complaint, which would concentrate the signal in the optic-nerve terms without any difference in underlying incidence. Indication confounding acts in the opposite direction, inflating the ocular signal as a whole; the elevation of the ocular infections query is the clearest example: it may partly reflect confounding by indication and channelling, including the underlying ocular infection, rather than a direct drug effect.</w:t>
+        <w:t>Spontaneous reporting has no denominator, and under-reporting is substantial and non-random. Three biases are relevant, and they act differently on the main result. Notoriety bias — increased reporting of a known adverse effect — raises the absolute ocular signal but does not by itself produce a contrast between optic-nerve terms and cataract, dry eye or glaucoma, because all of them sit in the same reports. Sharing a database and an exposure definition does not, however, make every bias common to all outcomes: the clinician who suspects ethambutol toxicity may code the optic-nerve diagnosis precisely and leave a visual complaint uncoded. The comparison narrows the range of explanations but does not eliminate outcome-specific reporting: differential coding is the more serious concern, clinicians who suspect ethambutol toxicity may code optic neuropathy more precisely than they code a non-specific complaint, which would concentrate the signal in the optic-nerve terms without any difference in underlying incidence. Indication confounding acts in the opposite direction, inflating the ocular signal as a whole; the elevation of the ocular infections query is the clearest example: it may partly reflect confounding by indication and channelling, including the underlying ocular infection, rather than a direct drug effect.</w:t>
       </w:r>
     </w:p>
     <w:p>
@@ -1003,7 +1003,7 @@
         <w:jc w:val="both"/>
       </w:pPr>
       <w:r>
-        <w:t>What the comparison supports is narrower than a ranking of ocular toxicity. The eleven queries are not independent: preferred terms belong to more than one of them, the background frequency of each condition differs in the underlying population, and the disease mix of the reports is not the same across queries. An ordering of odds ratios is therefore a description of the reporting signal, not a test that ethambutol affects one ocular structure more than another; no contrast between queries was tested. The controls bound the conclusion in both directions. The four negative-control terms did not show positive disproportionality signals, whereas the non-specific comparators were not uniformly null: eye pain was below unity, but vision blurred showed a modest elevation (1.50, 1.28–1.76). The absence of comparable elevations for the negative-control terms is less consistent with a uniform increase in ocular reporting. The vision-blurred signal, and the possibility of outcome-specific recognition and coding, mean that the internal contrast cannot establish anatomical specificity or exclude reporting bias. It also does not show that the negative-control events are not caused by the drug: a true effect that is small relative to background reporting would not appear. The result is a statement about the shape of the reporting signal, not a toxicity profile. Restriction to suspect-drug reports and the period split change the size of the estimate without changing its direction. The fixed-regimen analysis — rifampicin, isoniazid and pyrazinamide with versus without ethambutol — holds the background regimen constant but is a within-class reporting contrast, not a matched cohort: treatment duration, dose, disease severity and co-medication are not held constant, and the denominator is reports rather than treated patients. It rests on a small unexposed group and its interval includes unity, so it is reported for completeness rather than as evidence of a within-class effect.</w:t>
+        <w:t>What the comparison supports is narrower than a ranking of ocular toxicity. The eleven queries are not independent: preferred terms belong to more than one of them, the background frequency of each condition differs in the underlying population, and the disease mix of the reports is not the same across queries. An ordering of odds ratios is therefore a description of the reporting signal, not a test that ethambutol affects one ocular structure more than another; no contrast between queries was tested. The controls bound the conclusion in both directions. The four negative-control terms did not show positive disproportionality signals, whereas the non-specific comparators were not uniformly null: eye pain was below unity, but vision blurred showed a modest elevation (1.50, 1.28–1.76). The vision-blurred signal, and the possibility of outcome-specific recognition and coding, mean that the internal contrast cannot establish anatomical specificity or exclude reporting bias. It also cannot exclude a true effect of the drug that is small relative to background reporting. Restriction to suspect-drug reports and the period split change the size of the estimate without changing its direction. The fixed-regimen analysis — rifampicin, isoniazid and pyrazinamide with versus without ethambutol — holds the background regimen constant but is a within-class reporting contrast, not a matched cohort: treatment duration, dose, disease severity and co-medication are not held constant, and the denominator is reports rather than treated patients. It rests on a small unexposed group and its interval includes unity, so it is reported for completeness rather than as evidence of a within-class effect.</w:t>
       </w:r>
     </w:p>
     <w:p>
@@ -1023,7 +1023,7 @@
         <w:jc w:val="both"/>
       </w:pPr>
       <w:r>
-        <w:t>The transcriptomic reanalysis was included because the mechanisms proposed for this toxicity make directional predictions that can be checked in human cells, not because it can resolve the mechanism. Three limits are decisive for how it should be read. The exposure was 8 mM for 24 hours, 330 to 800 times the peak plasma concentration at standard dosage, so the experiment models an acute millimolar insult rather than the months of therapeutic exposure over which the clinical toxicity develops. The preparation is a monoculture of retinal ganglion-like cells, so contributions from microglia, Müller glia or the retinal vasculature are invisible to it, and the predictions were assembled after the data were in hand, so the analysis can show that a predicted direction was not observed but cannot confirm or refute a mechanism operating in patients. The antioxidant, autophagic and oxidative-phosphorylation programmes moved in the predicted directions; the ferroptosis account [19] predicted a fall in SLC7A11 and GPX4 and their transcripts rose, so the appropriate conclusion is that the data provide no consistent transcriptional support for the ferroptosis prediction under these conditions; they do not exclude ferroptosis, and they cannot, because transcript levels are not a flux measurement.</w:t>
+        <w:t>The transcriptomic reanalysis was included because the mechanisms proposed for this toxicity make directional predictions that can be checked in human cells, not because it can resolve the mechanism. Three limits govern how it should be read. The exposure was 8 mM for 24 hours, 330 to 800 times the peak plasma concentration at standard dosage, so the experiment models an acute millimolar insult rather than the months of therapeutic exposure over which the clinical toxicity develops. The preparation is a monoculture of retinal ganglion-like cells, so contributions from microglia, Müller glia or the retinal vasculature are invisible to it, and the predictions were assembled after the data were in hand, so the analysis can show that a predicted direction was not observed but cannot confirm or refute a mechanism operating in patients. The antioxidant, autophagic and oxidative-phosphorylation programmes moved in the predicted directions; the ferroptosis account [19] predicted a fall in SLC7A11 and GPX4 and their transcripts rose, so the appropriate conclusion is that the data provide no consistent transcriptional support for the ferroptosis prediction under these conditions; they do not exclude ferroptosis, and they cannot, because transcript levels are not a flux measurement.</w:t>
       </w:r>
     </w:p>
     <w:p>
@@ -1043,7 +1043,7 @@
         <w:jc w:val="both"/>
       </w:pPr>
       <w:r>
-        <w:t>The practical value of a reporting signal of this shape is that it identifies where to look, and it should be read as a reason for clinical vigilance rather than as a basis for a screening schedule. Ethambutol optic neuropathy is managed by stopping the drug, and the damage becomes irreversible once atrophy is established, so detection before that point is what matters. In these data the reported time to onset had a median of 125 days, with 11.0% of optic-nerve events reported within 30 days of starting treatment and 23.2% within 60 days. That median comes from the 17-term case-level definition and the 83 reports with complete dates, not from the 432-case query, and it describes reports with complete dates rather than the incidence we would see in a monitored cohort: reports are a selected subset, the date of onset is recorded retrospectively, and no examinations that were not performed can appear in it. It is therefore consistent with a baseline examination and an early first follow-up, and with the clinical literature in which structural measures predict visual outcome better than initial acuity [10,11,12,13], but it cannot set the interval, and we do not derive one from it. Two further limits apply to these dates. Reports with an incomplete date pair are excluded, and their exclusion is unlikely to be random: a report that records both the start of therapy and the date of the event is one where the timing mattered to the reporter, which probably enriches the subset for events the reporter had already connected to the drug. And the definition used here is the 17-term case-level one, not the 45-term query, so the medians describe that subset rather than the main analysis.</w:t>
+        <w:t>A signal of this shape identifies where to look; it is a reason for vigilance, not a basis for a screening schedule. Ethambutol optic neuropathy is managed by stopping the drug, and the damage becomes irreversible once atrophy is established, so detection before that point is what matters. In these data the reported time to onset had a median of 125 days, with 11.0% of optic-nerve events reported within 30 days of starting treatment and 23.2% within 60 days. That median comes from the 17-term case-level definition and the 83 reports with complete dates, not from the 432-case query, and it describes reports with complete dates rather than the incidence we would see in a monitored cohort: reports are a selected subset, the date of onset is recorded retrospectively, and no examinations that were not performed can appear in it. It is therefore consistent with a baseline examination and an early first follow-up, and with the clinical literature in which structural measures predict visual outcome better than initial acuity [10,11,12,13], but it cannot set the interval, and we do not derive one from it. Two further limits apply to these dates. Reports with an incomplete date pair are excluded, and their exclusion is unlikely to be random: a report that records both the start of therapy and the date of the event is one where the timing mattered to the reporter, which probably enriches the subset for events the reporter had already connected to the drug.</w:t>
       </w:r>
     </w:p>
     <w:p>

</xml_diff>

<commit_message>
Redraw Figure 1 as three independent modules and enlarge Figures 2-4
JADER and Canada Vigilance are separate panels with their own cohorts and definitions, and the replication label is gone; Figures 2 and 3 carry larger labels, and Figure 4 separates exposure role from reporting period with explicit log ticks.
</commit_message>
<xml_diff>
--- a/submission/Ethambutol_TADS_manuscript.docx
+++ b/submission/Ethambutol_TADS_manuscript.docx
@@ -5962,7 +5962,7 @@
       <w:r>
         <w:drawing>
           <wp:inline xmlns:a="http://schemas.openxmlformats.org/drawingml/2006/main" xmlns:pic="http://schemas.openxmlformats.org/drawingml/2006/picture">
-            <wp:extent cx="5580000" cy="3953022"/>
+            <wp:extent cx="5580000" cy="3750492"/>
             <wp:docPr id="1" name="Picture 1"/>
             <wp:cNvGraphicFramePr>
               <a:graphicFrameLocks noChangeAspect="1"/>
@@ -5983,7 +5983,7 @@
                   <pic:spPr>
                     <a:xfrm>
                       <a:off x="0" y="0"/>
-                      <a:ext cx="5580000" cy="3953022"/>
+                      <a:ext cx="5580000" cy="3750492"/>
                     </a:xfrm>
                     <a:prstGeom prst="rect"/>
                   </pic:spPr>
@@ -6010,7 +6010,7 @@
       <w:r>
         <w:drawing>
           <wp:inline xmlns:a="http://schemas.openxmlformats.org/drawingml/2006/main" xmlns:pic="http://schemas.openxmlformats.org/drawingml/2006/picture">
-            <wp:extent cx="5580000" cy="2844535"/>
+            <wp:extent cx="5580000" cy="2865938"/>
             <wp:docPr id="2" name="Picture 2"/>
             <wp:cNvGraphicFramePr>
               <a:graphicFrameLocks noChangeAspect="1"/>
@@ -6031,7 +6031,7 @@
                   <pic:spPr>
                     <a:xfrm>
                       <a:off x="0" y="0"/>
-                      <a:ext cx="5580000" cy="2844535"/>
+                      <a:ext cx="5580000" cy="2865938"/>
                     </a:xfrm>
                     <a:prstGeom prst="rect"/>
                   </pic:spPr>
@@ -6058,7 +6058,7 @@
       <w:r>
         <w:drawing>
           <wp:inline xmlns:a="http://schemas.openxmlformats.org/drawingml/2006/main" xmlns:pic="http://schemas.openxmlformats.org/drawingml/2006/picture">
-            <wp:extent cx="5580000" cy="2935908"/>
+            <wp:extent cx="5580000" cy="3505338"/>
             <wp:docPr id="3" name="Picture 3"/>
             <wp:cNvGraphicFramePr>
               <a:graphicFrameLocks noChangeAspect="1"/>
@@ -6079,7 +6079,7 @@
                   <pic:spPr>
                     <a:xfrm>
                       <a:off x="0" y="0"/>
-                      <a:ext cx="5580000" cy="2935908"/>
+                      <a:ext cx="5580000" cy="3505338"/>
                     </a:xfrm>
                     <a:prstGeom prst="rect"/>
                   </pic:spPr>
@@ -6106,7 +6106,7 @@
       <w:r>
         <w:drawing>
           <wp:inline xmlns:a="http://schemas.openxmlformats.org/drawingml/2006/main" xmlns:pic="http://schemas.openxmlformats.org/drawingml/2006/picture">
-            <wp:extent cx="5580000" cy="2533448"/>
+            <wp:extent cx="5580000" cy="2483155"/>
             <wp:docPr id="4" name="Picture 4"/>
             <wp:cNvGraphicFramePr>
               <a:graphicFrameLocks noChangeAspect="1"/>
@@ -6127,7 +6127,7 @@
                   <pic:spPr>
                     <a:xfrm>
                       <a:off x="0" y="0"/>
-                      <a:ext cx="5580000" cy="2533448"/>
+                      <a:ext cx="5580000" cy="2483155"/>
                     </a:xfrm>
                     <a:prstGeom prst="rect"/>
                   </pic:spPr>

</xml_diff>

<commit_message>
Enlarge Figure 2-4 canvases and stage the PDF build against file locks
</commit_message>
<xml_diff>
--- a/submission/Ethambutol_TADS_manuscript.docx
+++ b/submission/Ethambutol_TADS_manuscript.docx
@@ -6010,7 +6010,7 @@
       <w:r>
         <w:drawing>
           <wp:inline xmlns:a="http://schemas.openxmlformats.org/drawingml/2006/main" xmlns:pic="http://schemas.openxmlformats.org/drawingml/2006/picture">
-            <wp:extent cx="5580000" cy="2865938"/>
+            <wp:extent cx="5580000" cy="3369424"/>
             <wp:docPr id="2" name="Picture 2"/>
             <wp:cNvGraphicFramePr>
               <a:graphicFrameLocks noChangeAspect="1"/>
@@ -6031,7 +6031,7 @@
                   <pic:spPr>
                     <a:xfrm>
                       <a:off x="0" y="0"/>
-                      <a:ext cx="5580000" cy="2865938"/>
+                      <a:ext cx="5580000" cy="3369424"/>
                     </a:xfrm>
                     <a:prstGeom prst="rect"/>
                   </pic:spPr>
@@ -6058,7 +6058,7 @@
       <w:r>
         <w:drawing>
           <wp:inline xmlns:a="http://schemas.openxmlformats.org/drawingml/2006/main" xmlns:pic="http://schemas.openxmlformats.org/drawingml/2006/picture">
-            <wp:extent cx="5580000" cy="3505338"/>
+            <wp:extent cx="5580000" cy="4287315"/>
             <wp:docPr id="3" name="Picture 3"/>
             <wp:cNvGraphicFramePr>
               <a:graphicFrameLocks noChangeAspect="1"/>
@@ -6079,7 +6079,7 @@
                   <pic:spPr>
                     <a:xfrm>
                       <a:off x="0" y="0"/>
-                      <a:ext cx="5580000" cy="3505338"/>
+                      <a:ext cx="5580000" cy="4287315"/>
                     </a:xfrm>
                     <a:prstGeom prst="rect"/>
                   </pic:spPr>
@@ -6106,7 +6106,7 @@
       <w:r>
         <w:drawing>
           <wp:inline xmlns:a="http://schemas.openxmlformats.org/drawingml/2006/main" xmlns:pic="http://schemas.openxmlformats.org/drawingml/2006/picture">
-            <wp:extent cx="5580000" cy="2483155"/>
+            <wp:extent cx="5580000" cy="3037879"/>
             <wp:docPr id="4" name="Picture 4"/>
             <wp:cNvGraphicFramePr>
               <a:graphicFrameLocks noChangeAspect="1"/>
@@ -6127,7 +6127,7 @@
                   <pic:spPr>
                     <a:xfrm>
                       <a:off x="0" y="0"/>
-                      <a:ext cx="5580000" cy="2483155"/>
+                      <a:ext cx="5580000" cy="3037879"/>
                     </a:xfrm>
                     <a:prstGeom prst="rect"/>
                   </pic:spPr>

</xml_diff>

<commit_message>
Pre-submission pass: compress abstract to 249/250 words, add 300dpi figure PNGs, cover letter v2 (dated, corresponding-author signature), novelty-scan report, retarget release tag v2.1
</commit_message>
<xml_diff>
--- a/submission/Ethambutol_TADS_manuscript.docx
+++ b/submission/Ethambutol_TADS_manuscript.docx
@@ -93,7 +93,7 @@
         <w:t>Background.</w:t>
       </w:r>
       <w:r>
-        <w:t xml:space="preserve"> Ethambutol causes an optic neuropathy, and its ocular signal is well recognised. Whether it is concentrated in the optic nerve, rather than a general increase in ocular reporting, is untested against MedDRA's queries.</w:t>
+        <w:t xml:space="preserve"> Ethambutol's ocular signal is well recognised; whether reporting is concentrated in the optic nerve rather than generally ocular is untested against MedDRA's queries.</w:t>
       </w:r>
     </w:p>
     <w:p>
@@ -107,7 +107,7 @@
         <w:t>Objectives.</w:t>
       </w:r>
       <w:r>
-        <w:t xml:space="preserve"> To test whether ethambutol reports show an optic-nerve-predominant reporting pattern across ocular queries, and whether it replicates in independent systems.</w:t>
+        <w:t xml:space="preserve"> To test for an optic-nerve-predominant pattern across ocular queries and its replication in independent systems.</w:t>
       </w:r>
     </w:p>
     <w:p>
@@ -121,7 +121,7 @@
         <w:t>Design.</w:t>
       </w:r>
       <w:r>
-        <w:t xml:space="preserve"> Retrospective disproportionality analysis of case safety reports, with replication and exploratory transcriptomics.</w:t>
+        <w:t xml:space="preserve"> Retrospective disproportionality analysis with replication and exploratory transcriptomics.</w:t>
       </w:r>
     </w:p>
     <w:p>
@@ -135,7 +135,7 @@
         <w:t>Methods.</w:t>
       </w:r>
       <w:r>
-        <w:t xml:space="preserve"> All 90 quarterly FDA Adverse Event Reporting System releases (2004Q1–2026Q2) were de-duplicated by case version. In 15,510 ethambutol cases we computed reporting odds ratios (ROR) for the eleven ocular Standardised MedDRA Queries (narrow sets, MedDRA 29.0), with Benjamini–Hochberg control, and described the terms inside the optic-nerve query against pre-specified controls. Exposure role, period and a fixed-regimen contrast were sensitivity analyses, and the pattern was tested in JADER and Canada Vigilance.</w:t>
+        <w:t xml:space="preserve"> All 90 quarterly FDA Adverse Event Reporting System (FAERS) releases (2004Q1–2026Q2) were de-duplicated by case version; in 15,510 ethambutol cases we computed reporting odds ratios (ROR) for the eleven ocular Standardised MedDRA Queries (narrow, MedDRA 29.0) with Benjamini–Hochberg control and pre-specified non-specific terms; exposure role, period and a fixed-regimen contrast were sensitivity analyses; the pattern was tested in JADER and Canada Vigilance.</w:t>
       </w:r>
     </w:p>
     <w:p>
@@ -149,7 +149,7 @@
         <w:t>Results.</w:t>
       </w:r>
       <w:r>
-        <w:t xml:space="preserve"> The optic-nerve query had the highest ROR (23.51, 95% CI 21.35–25.89; 432 cases); four showed positive signals, three were significantly below 1 and four had intervals spanning 1. Optic neuropathy (165; 116.58, 99.36–136.78) and optic neuritis (156; 23.67, 20.19–27.75) carried it. The four negative controls showed no positive signal; vision blurred did (1.50, 1.28–1.76). A term-level signal was also seen in JADER (optic neuropathy 570.96, 413.50–788.37); Canada Vigilance showed a broader string-matched composite (21.85, 14.13–33.79). The non-specific comparison was possible in FAERS and JADER, not Canada. Among reports with usable dates, median onset was 125 days for optic-nerve events against 33 for non-ocular events. Exploratory transcriptomics did not reproduce selected ferroptosis predictions, whose relevance is uncertain.</w:t>
+        <w:t xml:space="preserve"> The optic-nerve query had the highest ROR (23.51, 95% CI 21.35–25.89; 432 cases); four showed positive signals, three were below 1 and four spanned 1. Optic neuropathy (165; 116.58, 99.36–136.78) and optic neuritis (156; 23.67, 20.19–27.75) carried it. Negative controls showed no positive signal; vision blurred did (1.50, 1.28–1.76). JADER showed a term-level signal (optic neuropathy 570.96, 413.50–788.37); Canada Vigilance a broader string-matched composite (21.85, 14.13–33.79); the non-specific comparison was possible in FAERS and JADER only. Median onset among dated reports: 125 days (optic-nerve) versus 33 (non-ocular). Transcriptomics did not reproduce selected ferroptosis predictions.</w:t>
       </w:r>
     </w:p>
     <w:p>
@@ -413,14 +413,6 @@
       </w:r>
     </w:p>
     <w:p>
-      <w:r>
-        <w:rPr>
-          <w:i/>
-        </w:rPr>
-        <w:t>[Figure 1 near here]</w:t>
-      </w:r>
-    </w:p>
-    <w:p>
       <w:pPr>
         <w:pStyle w:val="Heading3"/>
         <w:numPr>
@@ -664,7 +656,7 @@
           <w:rFonts w:ascii="Consolas" w:hAnsi="Consolas"/>
           <w:sz w:val="19"/>
         </w:rPr>
-        <w:t>v2.0-tads-2026-10-21</w:t>
+        <w:t>v2.1-tads-2026-10-24</w:t>
       </w:r>
       <w:r>
         <w:t>, which identifies the commit from which the numbers, tables and figures in this manuscript were generated.</w:t>
@@ -723,14 +715,6 @@
       </w:r>
     </w:p>
     <w:p>
-      <w:r>
-        <w:rPr>
-          <w:i/>
-        </w:rPr>
-        <w:t>[Figure 2 near here]</w:t>
-      </w:r>
-    </w:p>
-    <w:p>
       <w:pPr>
         <w:jc w:val="both"/>
       </w:pPr>
@@ -759,14 +743,6 @@
       </w:r>
     </w:p>
     <w:p>
-      <w:r>
-        <w:rPr>
-          <w:i/>
-        </w:rPr>
-        <w:t>[Figure 3 near here]</w:t>
-      </w:r>
-    </w:p>
-    <w:p>
       <w:pPr>
         <w:jc w:val="both"/>
       </w:pPr>
@@ -792,14 +768,6 @@
       </w:pPr>
       <w:r>
         <w:t>Restricting exposure to reports naming ethambutol as the primary or secondary suspect drug increased both estimates, because the cohort is smaller and more specifically exposed: the query rose from 23.51 to 35.01 (370 cases exposed) and optic neuropathy from 116.58 to 191.22 (157 cases) (Figure 4).</w:t>
-      </w:r>
-    </w:p>
-    <w:p>
-      <w:r>
-        <w:rPr>
-          <w:i/>
-        </w:rPr>
-        <w:t>[Figure 4 near here]</w:t>
       </w:r>
     </w:p>
     <w:p>
@@ -1143,14 +1111,14 @@
         <w:t>results/main_results.json</w:t>
       </w:r>
       <w:r>
-        <w:t xml:space="preserve"> and the code that generates every table and figure — are available at https://github.com/Bowen2485/ethambutol-ocular-toxicity/tree/v2.0-tads-2026-10-21 (release tag </w:t>
+        <w:t xml:space="preserve"> and the code that generates every table and figure — are available at https://github.com/Bowen2485/ethambutol-ocular-toxicity/tree/v2.1-tads-2026-10-24 (release tag </w:t>
       </w:r>
       <w:r>
         <w:rPr>
           <w:rFonts w:ascii="Consolas" w:hAnsi="Consolas"/>
           <w:sz w:val="19"/>
         </w:rPr>
-        <w:t>v2.0-tads-2026-10-21</w:t>
+        <w:t>v2.1-tads-2026-10-24</w:t>
       </w:r>
       <w:r>
         <w:t>) under an MIT licence.</w:t>
@@ -5962,7 +5930,7 @@
       <w:r>
         <w:drawing>
           <wp:inline xmlns:a="http://schemas.openxmlformats.org/drawingml/2006/main" xmlns:pic="http://schemas.openxmlformats.org/drawingml/2006/picture">
-            <wp:extent cx="5580000" cy="3750492"/>
+            <wp:extent cx="5580000" cy="3753264"/>
             <wp:docPr id="1" name="Picture 1"/>
             <wp:cNvGraphicFramePr>
               <a:graphicFrameLocks noChangeAspect="1"/>
@@ -5983,7 +5951,7 @@
                   <pic:spPr>
                     <a:xfrm>
                       <a:off x="0" y="0"/>
-                      <a:ext cx="5580000" cy="3750492"/>
+                      <a:ext cx="5580000" cy="3753264"/>
                     </a:xfrm>
                     <a:prstGeom prst="rect"/>
                   </pic:spPr>
@@ -6010,7 +5978,7 @@
       <w:r>
         <w:drawing>
           <wp:inline xmlns:a="http://schemas.openxmlformats.org/drawingml/2006/main" xmlns:pic="http://schemas.openxmlformats.org/drawingml/2006/picture">
-            <wp:extent cx="5580000" cy="3369424"/>
+            <wp:extent cx="5580000" cy="3375267"/>
             <wp:docPr id="2" name="Picture 2"/>
             <wp:cNvGraphicFramePr>
               <a:graphicFrameLocks noChangeAspect="1"/>
@@ -6031,7 +5999,7 @@
                   <pic:spPr>
                     <a:xfrm>
                       <a:off x="0" y="0"/>
-                      <a:ext cx="5580000" cy="3369424"/>
+                      <a:ext cx="5580000" cy="3375267"/>
                     </a:xfrm>
                     <a:prstGeom prst="rect"/>
                   </pic:spPr>
@@ -6058,7 +6026,7 @@
       <w:r>
         <w:drawing>
           <wp:inline xmlns:a="http://schemas.openxmlformats.org/drawingml/2006/main" xmlns:pic="http://schemas.openxmlformats.org/drawingml/2006/picture">
-            <wp:extent cx="5580000" cy="4287315"/>
+            <wp:extent cx="5580000" cy="4290921"/>
             <wp:docPr id="3" name="Picture 3"/>
             <wp:cNvGraphicFramePr>
               <a:graphicFrameLocks noChangeAspect="1"/>
@@ -6079,7 +6047,7 @@
                   <pic:spPr>
                     <a:xfrm>
                       <a:off x="0" y="0"/>
-                      <a:ext cx="5580000" cy="4287315"/>
+                      <a:ext cx="5580000" cy="4290921"/>
                     </a:xfrm>
                     <a:prstGeom prst="rect"/>
                   </pic:spPr>
@@ -6106,7 +6074,7 @@
       <w:r>
         <w:drawing>
           <wp:inline xmlns:a="http://schemas.openxmlformats.org/drawingml/2006/main" xmlns:pic="http://schemas.openxmlformats.org/drawingml/2006/picture">
-            <wp:extent cx="5580000" cy="3037879"/>
+            <wp:extent cx="5580000" cy="3044431"/>
             <wp:docPr id="4" name="Picture 4"/>
             <wp:cNvGraphicFramePr>
               <a:graphicFrameLocks noChangeAspect="1"/>
@@ -6127,7 +6095,7 @@
                   <pic:spPr>
                     <a:xfrm>
                       <a:off x="0" y="0"/>
-                      <a:ext cx="5580000" cy="3037879"/>
+                      <a:ext cx="5580000" cy="3044431"/>
                     </a:xfrm>
                     <a:prstGeom prst="rect"/>
                   </pic:spPr>

</xml_diff>

<commit_message>
Integrate cross-verification: fix TTO percentages to 10.8 and 22.9 of 83, correct JADER suspect-proportion direction, note sparse negative controls, restore 24-page figure PDF, retarget tag v2.2
</commit_message>
<xml_diff>
--- a/submission/Ethambutol_TADS_manuscript.docx
+++ b/submission/Ethambutol_TADS_manuscript.docx
@@ -563,7 +563,7 @@
         <w:jc w:val="both"/>
       </w:pPr>
       <w:r>
-        <w:t>The optic-nerve comparison was run in JADER and in Canada Vigilance, but the two systems do not supply the same endpoint. JADER provides MedDRA/J terms for the optic-nerve and the non-specific terms alike, so the FAERS contrast can be repeated at term level. The Canadian extract carries a composite of every preferred term containing the string OPTIC (29 such terms appear in the extract) and a system-organ-class count, but no term-level control panel. That composite is a study-specific string match, not a re-implementation of the 45-term query: it includes terms whose clinical meaning differs from drug-induced optic neuropathy, such as imaging terms and surgical procedures, so the Canadian analysis is reported as exploratory and is not treated as an equivalent replication. JADER provides MedDRA/J terms and no English column, so each term was mapped to its Japanese equivalent and the mapping is published in the supplement. Every analysed term had a Japanese equivalent, so no term was excluded for mapping failure. Exposure in JADER used the suspect-drug code, with a sensitivity analysis over all drug roles; Canada Vigilance was read with exposure taken from the ingredient table rather than the product name, so that brand-only entries are captured. The 2×2 construction and the interval were identical to those used in FAERS. Because the systems code suspect drugs differently — 1,798 of 3,483 JADER ethambutol cases name the drug as suspect, a much higher proportion than in FAERS — the comparison is by pattern and by direction, not by the magnitude of the ROR, and case counts are shown alongside every estimate.</w:t>
+        <w:t>The optic-nerve comparison was run in JADER and in Canada Vigilance, but the two systems do not supply the same endpoint. JADER provides MedDRA/J terms for the optic-nerve and the non-specific terms alike, so the FAERS contrast can be repeated at term level. The Canadian extract carries a composite of every preferred term containing the string OPTIC (29 such terms appear in the extract) and a system-organ-class count, but no term-level control panel. That composite is a study-specific string match, not a re-implementation of the 45-term query: it includes terms whose clinical meaning differs from drug-induced optic neuropathy, such as imaging terms and surgical procedures, so the Canadian analysis is reported as exploratory and is not treated as an equivalent replication. JADER provides MedDRA/J terms and no English column, so each term was mapped to its Japanese equivalent and the mapping is published in the supplement. Every analysed term had a Japanese equivalent, so no term was excluded for mapping failure. Exposure in JADER used the suspect-drug code, with a sensitivity analysis over all drug roles; Canada Vigilance was read with exposure taken from the ingredient table rather than the product name, so that brand-only entries are captured. The 2×2 construction and the interval were identical to those used in FAERS. Because the systems code suspect drugs differently — 1,798 of 3,483 JADER ethambutol cases (51.6%) name the drug as suspect, against 9,024 of 15,510 (58.2%) in FAERS — the comparison is by pattern and by direction, not by the magnitude of the ROR, and case counts are shown alongside every estimate.</w:t>
       </w:r>
     </w:p>
     <w:p>
@@ -656,7 +656,7 @@
           <w:rFonts w:ascii="Consolas" w:hAnsi="Consolas"/>
           <w:sz w:val="19"/>
         </w:rPr>
-        <w:t>v2.1-tads-2026-10-24</w:t>
+        <w:t>v2.2-tads-2026-10-25</w:t>
       </w:r>
       <w:r>
         <w:t>, which identifies the commit from which the numbers, tables and figures in this manuscript were generated.</w:t>
@@ -747,7 +747,7 @@
         <w:jc w:val="both"/>
       </w:pPr>
       <w:r>
-        <w:t>The four pre-specified negative controls showed no positive disproportionality signal: cataract 0.89 (0.65–1.22), conjunctivitis 0.81 (0.45–1.46), dry eye 0.28 (0.15–0.52) and glaucoma 0.28 (0.11–0.75). The two non-specific comparators behaved differently from one another: eye pain was reported less often than expected (0.66, 0.45–0.96), whereas vision blurred showed a modest excess (1.50, 1.28–1.76; 151 cases). This pattern is less consistent with a uniform increase across all ocular reporting, although outcome-specific recognition and coding cannot be excluded, and the excess for vision blurred is reported rather than set aside.</w:t>
+        <w:t>The four pre-specified negative controls showed no positive disproportionality signal: cataract 0.89 (0.65–1.22), conjunctivitis 0.81 (0.45–1.46), dry eye 0.28 (0.15–0.52) and glaucoma 0.28 (0.11–0.75); the counts for dry eye and glaucoma are small and these two estimates are imprecise, though their upper confidence limits remain below unity. The two non-specific comparators behaved differently from one another: eye pain was reported less often than expected (0.66, 0.45–0.96), whereas vision blurred showed a modest excess (1.50, 1.28–1.76; 151 cases). This pattern is less consistent with a uniform increase across all ocular reporting, although outcome-specific recognition and coding cannot be excluded, and the excess for vision blurred is reported rather than set aside.</w:t>
       </w:r>
     </w:p>
     <w:p>
@@ -819,7 +819,7 @@
         <w:jc w:val="both"/>
       </w:pPr>
       <w:r>
-        <w:t>The extract of Canada Vigilance available to us carries the optic-nerve composite and the system-organ-class count, but not a term-level control panel comparable to the FAERS one; the term-level control comparison therefore rests on FAERS (Figure 3) and JADER, and the Canadian contribution is the direction of the optic-nerve contrast. The magnitude of these estimates differs between databases by more than an order of magnitude, and is not compared. JADER codes a much higher proportion of ethambutol reports as suspect than FAERS does (1,798 of 3,483 against 9,024 of 15,510), and the systems differ in reporting culture, in the terms available in their languages and in the size of their denominators. The three systems therefore contribute at different levels. FAERS provides the primary contrast between the eleven ocular queries and the term-level control comparison; JADER provides term-level external support, with its own exposure-role definition and a Japanese-to-English mapping; Canada Vigilance provides a broader, string-matched optic-related composite that points in the same direction but is not an equivalent replication. Cross-system replication therefore applies to the direction of the optic-nerve signal, whereas the full internal-control pattern was examined in one database and, at term level, in a second. Case counts are shown alongside every estimate because a large ratio computed on a handful of cases is not the same finding as a moderate ratio computed on hundreds.</w:t>
+        <w:t>The extract of Canada Vigilance available to us carries the optic-nerve composite and the system-organ-class count, but not a term-level control panel comparable to the FAERS one; the term-level control comparison therefore rests on FAERS (Figure 3) and JADER, and the Canadian contribution is the direction of the optic-nerve contrast. The magnitude of these estimates differs between databases by more than an order of magnitude, and is not compared. The proportion of ethambutol reports naming the drug as suspect is broadly similar in the two systems (JADER 1,798 of 3,483, 51.6%; FAERS 9,024 of 15,510, 58.2%), and the systems differ in reporting culture, in the terms available in their languages and in the size of their denominators. The three systems therefore contribute at different levels. FAERS provides the primary contrast between the eleven ocular queries and the term-level control comparison; JADER provides term-level external support, with its own exposure-role definition and a Japanese-to-English mapping; Canada Vigilance provides a broader, string-matched optic-related composite that points in the same direction but is not an equivalent replication. Cross-system replication therefore applies to the direction of the optic-nerve signal, whereas the full internal-control pattern was examined in one database and, at term level, in a second. Case counts are shown alongside every estimate because a large ratio computed on a handful of cases is not the same finding as a moderate ratio computed on hundreds.</w:t>
       </w:r>
     </w:p>
     <w:p>
@@ -1011,7 +1011,7 @@
         <w:jc w:val="both"/>
       </w:pPr>
       <w:r>
-        <w:t>A signal of this shape identifies where to look; it is a reason for vigilance, not a basis for a screening schedule. Ethambutol optic neuropathy is managed by stopping the drug, and the damage becomes irreversible once atrophy is established, so detection before that point is what matters. In these data the reported time to onset had a median of 125 days, with 11.0% of optic-nerve events reported within 30 days of starting treatment and 23.2% within 60 days. That median comes from the 17-term case-level definition and the 83 reports with complete dates, not from the 432-case query, and it describes reports with complete dates rather than the incidence we would see in a monitored cohort: reports are a selected subset, the date of onset is recorded retrospectively, and no examinations that were not performed can appear in it. It is therefore consistent with a baseline examination and an early first follow-up, and with the clinical literature in which structural measures predict visual outcome better than initial acuity [10,11,12,13], but it cannot set the interval, and we do not derive one from it. Two further limits apply to these dates. Reports with an incomplete date pair are excluded, and their exclusion is unlikely to be random: a report that records both the start of therapy and the date of the event is one where the timing mattered to the reporter, which probably enriches the subset for events the reporter had already connected to the drug.</w:t>
+        <w:t>A signal of this shape identifies where to look; it is a reason for vigilance, not a basis for a screening schedule. Ethambutol optic neuropathy is managed by stopping the drug, and the damage becomes irreversible once atrophy is established, so detection before that point is what matters. In these data the reported time to onset had a median of 125 days, with 10.8% (9 of 83) of optic-nerve events reported within 30 days of starting treatment and 22.9% (19 of 83) within 60 days. That median comes from the 17-term case-level definition and the 83 reports with complete dates, not from the 432-case query, and it describes reports with complete dates rather than the incidence we would see in a monitored cohort: reports are a selected subset, the date of onset is recorded retrospectively, and no examinations that were not performed can appear in it. It is therefore consistent with a baseline examination and an early first follow-up, and with the clinical literature in which structural measures predict visual outcome better than initial acuity [10,11,12,13], but it cannot set the interval, and we do not derive one from it. Two further limits apply to these dates. Reports with an incomplete date pair are excluded, and their exclusion is unlikely to be random: a report that records both the start of therapy and the date of the event is one where the timing mattered to the reporter, which probably enriches the subset for events the reporter had already connected to the drug.</w:t>
       </w:r>
     </w:p>
     <w:p>
@@ -1111,14 +1111,14 @@
         <w:t>results/main_results.json</w:t>
       </w:r>
       <w:r>
-        <w:t xml:space="preserve"> and the code that generates every table and figure — are available at https://github.com/Bowen2485/ethambutol-ocular-toxicity/tree/v2.1-tads-2026-10-24 (release tag </w:t>
+        <w:t xml:space="preserve"> and the code that generates every table and figure — are available at https://github.com/Bowen2485/ethambutol-ocular-toxicity/tree/v2.2-tads-2026-10-25 (release tag </w:t>
       </w:r>
       <w:r>
         <w:rPr>
           <w:rFonts w:ascii="Consolas" w:hAnsi="Consolas"/>
           <w:sz w:val="19"/>
         </w:rPr>
-        <w:t>v2.1-tads-2026-10-24</w:t>
+        <w:t>v2.2-tads-2026-10-25</w:t>
       </w:r>
       <w:r>
         <w:t>) under an MIT licence.</w:t>

</xml_diff>